<commit_message>
Module 3 — v5: Harness verification for the revision pass
Brings the same code-based verification to the resume revision and proofreading stage. A second harness run now validates the text after proofreading edits are applied, rather than before, which fixes a sequencing bug in the prior version where the final output was never actually checked against the mechanical rules. Corrects a tier-detection bug whose role-prefix matching failed on real-world role IDs, causing the older-role word-count band to misapply. Scopes the advisory gate explicitly against the blocking gates so the two no longer overlap. As with Module 2, judgment gates are untouched, and a flagged fallback path remains for environments without code execution.
</commit_message>
<xml_diff>
--- a/resume-optimization-system:/modules:/Module_3_D2_Generation.docx
+++ b/resume-optimization-system:/modules:/Module_3_D2_Generation.docx
@@ -1,6 +1,6 @@
 
 <file path=word/document.xml><?xml version="1.0" encoding="utf-8"?>
-<w:document xmlns:wpc="http://schemas.microsoft.com/office/word/2010/wordprocessingCanvas" xmlns:cx="http://schemas.microsoft.com/office/drawing/2014/chartex" xmlns:cx1="http://schemas.microsoft.com/office/drawing/2015/9/8/chartex" xmlns:cx2="http://schemas.microsoft.com/office/drawing/2015/10/21/chartex" xmlns:cx3="http://schemas.microsoft.com/office/drawing/2016/5/9/chartex" xmlns:cx4="http://schemas.microsoft.com/office/drawing/2016/5/10/chartex" xmlns:cx5="http://schemas.microsoft.com/office/drawing/2016/5/11/chartex" xmlns:cx6="http://schemas.microsoft.com/office/drawing/2016/5/12/chartex" xmlns:cx7="http://schemas.microsoft.com/office/drawing/2016/5/13/chartex" xmlns:cx8="http://schemas.microsoft.com/office/drawing/2016/5/14/chartex" xmlns:mc="http://schemas.openxmlformats.org/markup-compatibility/2006" xmlns:aink="http://schemas.microsoft.com/office/drawing/2016/ink" xmlns:am3d="http://schemas.microsoft.com/office/drawing/2017/model3d" xmlns:o="urn:schemas-microsoft-com:office:office" xmlns:oel="http://schemas.microsoft.com/office/2019/extlst" xmlns:r="http://schemas.openxmlformats.org/officeDocument/2006/relationships" xmlns:m="http://schemas.openxmlformats.org/officeDocument/2006/math" xmlns:v="urn:schemas-microsoft-com:vml" xmlns:wp14="http://schemas.microsoft.com/office/word/2010/wordprocessingDrawing" xmlns:wp="http://schemas.openxmlformats.org/drawingml/2006/wordprocessingDrawing" xmlns:w10="urn:schemas-microsoft-com:office:word" xmlns:w="http://schemas.openxmlformats.org/wordprocessingml/2006/main" xmlns:w14="http://schemas.microsoft.com/office/word/2010/wordml" xmlns:w15="http://schemas.microsoft.com/office/word/2012/wordml" xmlns:w16cex="http://schemas.microsoft.com/office/word/2018/wordml/cex" xmlns:w16cid="http://schemas.microsoft.com/office/word/2016/wordml/cid" xmlns:w16="http://schemas.microsoft.com/office/word/2018/wordml" xmlns:w16du="http://schemas.microsoft.com/office/word/2023/wordml/word16du" xmlns:w16sdtdh="http://schemas.microsoft.com/office/word/2020/wordml/sdtdatahash" xmlns:w16sdtfl="http://schemas.microsoft.com/office/word/2024/wordml/sdtformatlock" xmlns:w16se="http://schemas.microsoft.com/office/word/2015/wordml/symex" xmlns:wpg="http://schemas.microsoft.com/office/word/2010/wordprocessingGroup" xmlns:wpi="http://schemas.microsoft.com/office/word/2010/wordprocessingInk" xmlns:wne="http://schemas.microsoft.com/office/word/2006/wordml" xmlns:wps="http://schemas.microsoft.com/office/word/2010/wordprocessingShape" mc:Ignorable="w14 w15 w16se w16cid w16 w16cex w16sdtdh w16sdtfl w16du wp14">
+<w:document xmlns:wpc="http://schemas.microsoft.com/office/word/2010/wordprocessingCanvas" xmlns:cx="http://schemas.microsoft.com/office/drawing/2014/chartex" xmlns:cx1="http://schemas.microsoft.com/office/drawing/2015/9/8/chartex" xmlns:cx2="http://schemas.microsoft.com/office/drawing/2015/10/21/chartex" xmlns:cx3="http://schemas.microsoft.com/office/drawing/2016/5/9/chartex" xmlns:cx4="http://schemas.microsoft.com/office/drawing/2016/5/10/chartex" xmlns:cx5="http://schemas.microsoft.com/office/drawing/2016/5/11/chartex" xmlns:cx6="http://schemas.microsoft.com/office/drawing/2016/5/12/chartex" xmlns:cx7="http://schemas.microsoft.com/office/drawing/2016/5/13/chartex" xmlns:cx8="http://schemas.microsoft.com/office/drawing/2016/5/14/chartex" xmlns:mc="http://schemas.openxmlformats.org/markup-compatibility/2006" xmlns:m="http://schemas.openxmlformats.org/officeDocument/2006/math" xmlns:aink="http://schemas.microsoft.com/office/drawing/2016/ink" xmlns:am3d="http://schemas.microsoft.com/office/drawing/2017/model3d" xmlns:oel="http://schemas.microsoft.com/office/2019/extlst" xmlns:r="http://schemas.openxmlformats.org/officeDocument/2006/relationships" xmlns:wp14="http://schemas.microsoft.com/office/word/2010/wordprocessingDrawing" xmlns:wp="http://schemas.openxmlformats.org/drawingml/2006/wordprocessingDrawing" xmlns:wpg="http://schemas.microsoft.com/office/word/2010/wordprocessingGroup" xmlns:wpi="http://schemas.microsoft.com/office/word/2010/wordprocessingInk" xmlns:wps="http://schemas.microsoft.com/office/word/2010/wordprocessingShape" xmlns:o="urn:schemas-microsoft-com:office:office" xmlns:v="urn:schemas-microsoft-com:vml" xmlns:w10="urn:schemas-microsoft-com:office:word" xmlns:w="http://schemas.openxmlformats.org/wordprocessingml/2006/main" xmlns:w14="http://schemas.microsoft.com/office/word/2010/wordml" xmlns:w15="http://schemas.microsoft.com/office/word/2012/wordml" xmlns:w16cex="http://schemas.microsoft.com/office/word/2018/wordml/cex" xmlns:w16cid="http://schemas.microsoft.com/office/word/2016/wordml/cid" xmlns:w16="http://schemas.microsoft.com/office/word/2018/wordml" xmlns:w16sdtdh="http://schemas.microsoft.com/office/word/2020/wordml/sdtdatahash" xmlns:w16sdtfl="http://schemas.microsoft.com/office/word/2024/wordml/sdtformatlock" xmlns:w16se="http://schemas.microsoft.com/office/word/2015/wordml/symex" xmlns:w16du="http://schemas.microsoft.com/office/word/2023/wordml/word16du" xmlns:wne="http://schemas.microsoft.com/office/word/2006/wordml" mc:Ignorable="w14 w15 w16se w16cid w16 w16cex w16sdtdh w16sdtfl w16du wp14">
   <w:body>
     <w:p>
       <w:pPr>
@@ -256,7 +256,7 @@
     </w:p>
     <w:p>
       <w:r>
-        <w:t>3. Step 2a (Offband if triggered) + Step 3 (D2 Copy) + Step 3a (Gate 8 Proofreading) -&gt; CHECKPOINT -&gt; STOP</w:t>
+        <w:t>3. Step 2a (Offband if triggered) + Step 3 (D2 Copy) + Step 3a (Gate 8 Proofreading) + Step 3b (Harness Run B) -&gt; CHECKPOINT -&gt; STOP</w:t>
       </w:r>
     </w:p>
     <w:p>
@@ -280,7 +280,7 @@
         </w:rPr>
       </w:pPr>
       <w:r>
-        <w:pict w14:anchorId="30332A74">
+        <w:pict w14:anchorId="07D2453D">
           <v:rect id="Horizontal Line 1" o:spid="_x0000_s1057" alt="" style="width:468pt;height:.05pt;visibility:visible;mso-wrap-style:square;mso-width-percent:0;mso-height-percent:0;mso-left-percent:-10001;mso-top-percent:-10001;mso-position-horizontal:absolute;mso-position-horizontal-relative:char;mso-position-vertical:absolute;mso-position-vertical-relative:line;mso-width-percent:0;mso-height-percent:0;mso-left-percent:-10001;mso-top-percent:-10001;v-text-anchor:top" filled="f">
             <o:lock v:ext="edit" rotation="t" aspectratio="t" verticies="t" text="t" shapetype="t"/>
             <w10:anchorlock/>
@@ -455,7 +455,7 @@
         </w:rPr>
       </w:pPr>
       <w:r>
-        <w:pict w14:anchorId="12BB1CEA">
+        <w:pict w14:anchorId="31E704DC">
           <v:rect id="Horizontal Line 2" o:spid="_x0000_s1056" alt="" style="width:468pt;height:.05pt;visibility:visible;mso-wrap-style:square;mso-width-percent:0;mso-height-percent:0;mso-left-percent:-10001;mso-top-percent:-10001;mso-position-horizontal:absolute;mso-position-horizontal-relative:char;mso-position-vertical:absolute;mso-position-vertical-relative:line;mso-width-percent:0;mso-height-percent:0;mso-left-percent:-10001;mso-top-percent:-10001;v-text-anchor:top" filled="f">
             <o:lock v:ext="edit" rotation="t" aspectratio="t" verticies="t" text="t" shapetype="t"/>
             <w10:anchorlock/>
@@ -625,7 +625,47 @@
           <w:szCs w:val="20"/>
           <w14:ligatures w14:val="none"/>
         </w:rPr>
-        <w:t>[ ] All gates show 0 violations in Module 2 output: [Y/N]</w:t>
+        <w:t>[ ] All blocking gates (1, 1.5, 2, 3, 4, 6, 7) show 0 violations in Module 2 output: [Y/N]</w:t>
+      </w:r>
+    </w:p>
+    <w:p>
+      <w:pPr>
+        <w:tabs>
+          <w:tab w:val="left" w:pos="916"/>
+          <w:tab w:val="left" w:pos="1832"/>
+          <w:tab w:val="left" w:pos="2748"/>
+          <w:tab w:val="left" w:pos="3664"/>
+          <w:tab w:val="left" w:pos="4580"/>
+          <w:tab w:val="left" w:pos="5496"/>
+          <w:tab w:val="left" w:pos="6412"/>
+          <w:tab w:val="left" w:pos="7328"/>
+          <w:tab w:val="left" w:pos="8244"/>
+          <w:tab w:val="left" w:pos="9160"/>
+          <w:tab w:val="left" w:pos="10076"/>
+          <w:tab w:val="left" w:pos="10992"/>
+          <w:tab w:val="left" w:pos="11908"/>
+          <w:tab w:val="left" w:pos="12824"/>
+          <w:tab w:val="left" w:pos="13740"/>
+          <w:tab w:val="left" w:pos="14656"/>
+        </w:tabs>
+        <w:spacing w:after="0" w:line="240" w:lineRule="auto"/>
+        <w:rPr>
+          <w:rFonts w:ascii="Courier New" w:eastAsia="Times New Roman" w:hAnsi="Courier New" w:cs="Courier New"/>
+          <w:kern w:val="0"/>
+          <w:sz w:val="20"/>
+          <w:szCs w:val="20"/>
+          <w14:ligatures w14:val="none"/>
+        </w:rPr>
+      </w:pPr>
+      <w:r>
+        <w:rPr>
+          <w:rFonts w:ascii="Courier New" w:eastAsia="Times New Roman" w:hAnsi="Courier New" w:cs="Courier New"/>
+          <w:kern w:val="0"/>
+          <w:sz w:val="20"/>
+          <w:szCs w:val="20"/>
+          <w14:ligatures w14:val="none"/>
+        </w:rPr>
+        <w:t>[ ] Harness Run A report with PASS [Y] verdict present: [Y/N]</w:t>
       </w:r>
     </w:p>
     <w:p>
@@ -1096,7 +1136,7 @@
         </w:rPr>
       </w:pPr>
       <w:r>
-        <w:pict w14:anchorId="478BC9B3">
+        <w:pict w14:anchorId="4A01B7C5">
           <v:rect id="Horizontal Line 3" o:spid="_x0000_s1055" alt="" style="width:468pt;height:.05pt;visibility:visible;mso-wrap-style:square;mso-width-percent:0;mso-height-percent:0;mso-left-percent:-10001;mso-top-percent:-10001;mso-position-horizontal:absolute;mso-position-horizontal-relative:char;mso-position-vertical:absolute;mso-position-vertical-relative:line;mso-width-percent:0;mso-height-percent:0;mso-left-percent:-10001;mso-top-percent:-10001;v-text-anchor:top" filled="f">
             <o:lock v:ext="edit" rotation="t" aspectratio="t" verticies="t" text="t" shapetype="t"/>
             <w10:anchorlock/>
@@ -1226,7 +1266,7 @@
         </w:rPr>
       </w:pPr>
       <w:r>
-        <w:pict w14:anchorId="3D16B634">
+        <w:pict w14:anchorId="44057C28">
           <v:rect id="Horizontal Line 4" o:spid="_x0000_s1054" alt="" style="width:468pt;height:.05pt;visibility:visible;mso-wrap-style:square;mso-width-percent:0;mso-height-percent:0;mso-left-percent:-10001;mso-top-percent:-10001;mso-position-horizontal:absolute;mso-position-horizontal-relative:char;mso-position-vertical:absolute;mso-position-vertical-relative:line;mso-width-percent:0;mso-height-percent:0;mso-left-percent:-10001;mso-top-percent:-10001;v-text-anchor:top" filled="f">
             <o:lock v:ext="edit" rotation="t" aspectratio="t" verticies="t" text="t" shapetype="t"/>
             <w10:anchorlock/>
@@ -1320,7 +1360,7 @@
           <w:kern w:val="0"/>
           <w14:ligatures w14:val="none"/>
         </w:rPr>
-        <w:t>[ ] Module 2 completed with all gates at 0 violations</w:t>
+        <w:t>[ ] Module 2 completed with all blocking gates at 0 violations (Gate 5 is advisory)</w:t>
       </w:r>
     </w:p>
     <w:p>
@@ -1483,7 +1523,7 @@
         </w:rPr>
       </w:pPr>
       <w:r>
-        <w:pict w14:anchorId="08642CDA">
+        <w:pict w14:anchorId="5E6A7C0F">
           <v:rect id="Horizontal Line 5" o:spid="_x0000_s1053" alt="" style="width:468pt;height:.05pt;visibility:visible;mso-wrap-style:square;mso-width-percent:0;mso-height-percent:0;mso-left-percent:-10001;mso-top-percent:-10001;mso-position-horizontal:absolute;mso-position-horizontal-relative:char;mso-position-vertical:absolute;mso-position-vertical-relative:line;mso-width-percent:0;mso-height-percent:0;mso-left-percent:-10001;mso-top-percent:-10001;v-text-anchor:top" filled="f">
             <o:lock v:ext="edit" rotation="t" aspectratio="t" verticies="t" text="t" shapetype="t"/>
             <w10:anchorlock/>
@@ -1634,7 +1674,7 @@
         </w:rPr>
       </w:pPr>
       <w:r>
-        <w:pict w14:anchorId="1FD7DB20">
+        <w:pict w14:anchorId="2725D6F4">
           <v:rect id="Horizontal Line 6" o:spid="_x0000_s1052" alt="" style="width:468pt;height:.05pt;visibility:visible;mso-wrap-style:square;mso-width-percent:0;mso-height-percent:0;mso-left-percent:-10001;mso-top-percent:-10001;mso-position-horizontal:absolute;mso-position-horizontal-relative:char;mso-position-vertical:absolute;mso-position-vertical-relative:line;mso-width-percent:0;mso-height-percent:0;mso-left-percent:-10001;mso-top-percent:-10001;v-text-anchor:top" filled="f">
             <o:lock v:ext="edit" rotation="t" aspectratio="t" verticies="t" text="t" shapetype="t"/>
             <w10:anchorlock/>
@@ -2171,7 +2211,7 @@
           <w:szCs w:val="20"/>
           <w14:ligatures w14:val="none"/>
         </w:rPr>
-        <w:t>- Gate 5: [0 violations]</w:t>
+        <w:t>- Gate 5: [N advisory flags — non-blocking]</w:t>
       </w:r>
     </w:p>
     <w:p>
@@ -2414,124 +2454,66 @@
     </w:p>
     <w:p/>
     <w:p>
-      <w:r>
-        <w:rPr>
+      <w:pPr>
+        <w:spacing w:before="100" w:beforeAutospacing="1" w:after="100" w:afterAutospacing="1" w:line="240" w:lineRule="auto"/>
+        <w:outlineLvl w:val="2"/>
+        <w:rPr>
+          <w:rFonts w:ascii="Times New Roman" w:eastAsia="Times New Roman" w:hAnsi="Times New Roman" w:cs="Times New Roman"/>
           <w:b/>
-        </w:rPr>
-        <w:t>PRE-OUTPUT MECHANICAL WORD COUNT CHECK (MANDATORY, BLOCKING):</w:t>
-      </w:r>
-    </w:p>
-    <w:p/>
-    <w:p>
-      <w:r>
-        <w:t>This is the third and final word count check (after Module 2 Section 4 and Section 6). It exists because Section 6 enforcement has historically failed when the model miscounts or rationalizes overages. This check is independent and authoritative.</w:t>
-      </w:r>
-    </w:p>
-    <w:p/>
-    <w:p>
-      <w:r>
-        <w:t>Run the following code execution against the FINAL bullet text as it will appear in D2:</w:t>
-      </w:r>
-    </w:p>
-    <w:p/>
-    <w:p>
-      <w:r>
-        <w:t>bullets = {</w:t>
-      </w:r>
-    </w:p>
-    <w:p>
-      <w:r>
-        <w:t xml:space="preserve">    "Role1-B1": "full final bullet text",</w:t>
-      </w:r>
-    </w:p>
-    <w:p>
-      <w:r>
-        <w:t xml:space="preserve">    # ... include ALL bullets that will appear in D2</w:t>
-      </w:r>
-    </w:p>
-    <w:p>
-      <w:r>
-        <w:t>}</w:t>
-      </w:r>
-    </w:p>
-    <w:p>
-      <w:r>
-        <w:t>ceilings = {"TOP2": 27, "older": 25}</w:t>
-      </w:r>
-    </w:p>
-    <w:p>
-      <w:r>
-        <w:t>for bid, text in bullets.items():</w:t>
-      </w:r>
-    </w:p>
-    <w:p>
-      <w:r>
-        <w:t xml:space="preserve">    wc = len(text.split())</w:t>
-      </w:r>
-    </w:p>
-    <w:p>
-      <w:r>
-        <w:t xml:space="preserve">    tier = "TOP2" if bid.startswith(("Role1-", "Role2-")) else "older"</w:t>
-      </w:r>
-    </w:p>
-    <w:p>
-      <w:r>
-        <w:lastRenderedPageBreak/>
-        <w:t xml:space="preserve">    status = "OK" if wc &lt;= ceilings[tier] else "VIOLATION"</w:t>
-      </w:r>
-    </w:p>
-    <w:p>
-      <w:r>
-        <w:t xml:space="preserve">    print(f"{bid}: {wc} words ({tier} ceiling {ceilings[tier]}) — {status}")</w:t>
-      </w:r>
-    </w:p>
-    <w:p/>
-    <w:p>
-      <w:r>
-        <w:rPr>
+          <w:bCs/>
+          <w:kern w:val="0"/>
+          <w:sz w:val="27"/>
+          <w:szCs w:val="27"/>
+          <w14:ligatures w14:val="none"/>
+        </w:rPr>
+      </w:pPr>
+      <w:r>
+        <w:rPr>
+          <w:rFonts w:ascii="Times New Roman" w:eastAsia="Times New Roman" w:hAnsi="Times New Roman" w:cs="Times New Roman"/>
           <w:b/>
-        </w:rPr>
-        <w:t xml:space="preserve">BLOCKING RULE: </w:t>
-      </w:r>
-      <w:r>
-        <w:t>If any bullet returns VIOLATION, do NOT generate D2. Do NOT proceed to Step 2 (Bullet Optimization Audit). Print the following message instead:</w:t>
-      </w:r>
-    </w:p>
-    <w:p/>
-    <w:p>
-      <w:pPr>
-        <w:ind w:left="720"/>
-      </w:pPr>
-      <w:r>
-        <w:t>BLOCKED AT MODULE 3 PRE-OUTPUT CHECK: [BulletID] = [N] words exceeds [tier] ceiling of [limit].</w:t>
-      </w:r>
-    </w:p>
-    <w:p>
-      <w:pPr>
-        <w:ind w:left="720"/>
-      </w:pPr>
-      <w:r>
-        <w:t>This is a Gate 3 violation that should have been caught at Module 2 Section 6. The bullet must be compressed, split, or re-scoped (per Module 2 Gate 3 rules) before D2 can be generated.</w:t>
-      </w:r>
-    </w:p>
-    <w:p>
-      <w:pPr>
-        <w:ind w:left="720"/>
-      </w:pPr>
-      <w:r>
-        <w:t>Returning to user with the violating bullet text and Evidence Ledger row for compression decision.</w:t>
-      </w:r>
-    </w:p>
-    <w:p/>
-    <w:p>
-      <w:r>
-        <w:rPr>
-          <w:b/>
-        </w:rPr>
-        <w:t xml:space="preserve">DO NOT auto-compress without user input. </w:t>
-      </w:r>
-      <w:r>
-        <w:t>Compression decisions affect evidence selection and must be visible to the user. Wait for user instruction on which compression action (split / drop / re-scope) to apply, then return to Module 2 Section 4 with the chosen action, then re-enter Module 3 from the top.</w:t>
+          <w:bCs/>
+          <w:kern w:val="0"/>
+          <w:sz w:val="27"/>
+          <w:szCs w:val="27"/>
+          <w14:ligatures w14:val="none"/>
+        </w:rPr>
+        <w:t>HARNESS RUN A VERIFICATION (replaces the former pre-output word count check)</w:t>
+      </w:r>
+    </w:p>
+    <w:p>
+      <w:pPr>
+        <w:spacing w:before="100" w:beforeAutospacing="1" w:after="100" w:afterAutospacing="1" w:line="240" w:lineRule="auto"/>
+        <w:rPr>
+          <w:rFonts w:ascii="Times New Roman" w:eastAsia="Times New Roman" w:hAnsi="Times New Roman" w:cs="Times New Roman"/>
+          <w:kern w:val="0"/>
+          <w14:ligatures w14:val="none"/>
+        </w:rPr>
+      </w:pPr>
+      <w:r>
+        <w:rPr>
+          <w:rFonts w:ascii="Times New Roman" w:eastAsia="Times New Roman" w:hAnsi="Times New Roman" w:cs="Times New Roman"/>
+          <w:kern w:val="0"/>
+          <w14:ligatures w14:val="none"/>
+        </w:rPr>
+        <w:t>Mechanical gates were code-verified by Harness Run A in Module 2 Section 6. Verify that the Run A report with verdict PASS [Y] is present in context. If it is absent, or its verdict is BLOCKED, STOP and return to Module 2 Section 6.</w:t>
+      </w:r>
+    </w:p>
+    <w:p>
+      <w:pPr>
+        <w:spacing w:before="100" w:beforeAutospacing="1" w:after="100" w:afterAutospacing="1" w:line="240" w:lineRule="auto"/>
+        <w:rPr>
+          <w:rFonts w:ascii="Times New Roman" w:eastAsia="Times New Roman" w:hAnsi="Times New Roman" w:cs="Times New Roman"/>
+          <w:kern w:val="0"/>
+          <w14:ligatures w14:val="none"/>
+        </w:rPr>
+      </w:pPr>
+      <w:r>
+        <w:rPr>
+          <w:rFonts w:ascii="Times New Roman" w:eastAsia="Times New Roman" w:hAnsi="Times New Roman" w:cs="Times New Roman"/>
+          <w:kern w:val="0"/>
+          <w14:ligatures w14:val="none"/>
+        </w:rPr>
+        <w:t>The authoritative check of the FINAL text is Harness Run B (Step 3b). It runs after Step 2 revisions, Step 2F compression, and Gate 8 fixes exist, which is why no word count check runs here: at this point in the sequence the final text does not exist yet.</w:t>
       </w:r>
     </w:p>
     <w:p/>
@@ -2659,7 +2641,7 @@
         </w:rPr>
       </w:pPr>
       <w:r>
-        <w:pict w14:anchorId="6CCC6E7B">
+        <w:pict w14:anchorId="1652F14A">
           <v:rect id="Horizontal Line 7" o:spid="_x0000_s1051" alt="" style="width:468pt;height:.05pt;visibility:visible;mso-wrap-style:square;mso-width-percent:0;mso-height-percent:0;mso-left-percent:-10001;mso-top-percent:-10001;mso-position-horizontal:absolute;mso-position-horizontal-relative:char;mso-position-vertical:absolute;mso-position-vertical-relative:line;mso-width-percent:0;mso-height-percent:0;mso-left-percent:-10001;mso-top-percent:-10001;v-text-anchor:top" filled="f">
             <o:lock v:ext="edit" rotation="t" aspectratio="t" verticies="t" text="t" shapetype="t"/>
             <w10:anchorlock/>
@@ -3157,7 +3139,7 @@
         </w:rPr>
       </w:pPr>
       <w:r>
-        <w:pict w14:anchorId="5691E911">
+        <w:pict w14:anchorId="642D2945">
           <v:rect id="Horizontal Line 8" o:spid="_x0000_s1050" alt="" style="width:468pt;height:.05pt;visibility:visible;mso-wrap-style:square;mso-width-percent:0;mso-height-percent:0;mso-left-percent:-10001;mso-top-percent:-10001;mso-position-horizontal:absolute;mso-position-horizontal-relative:char;mso-position-vertical:absolute;mso-position-vertical-relative:line;mso-width-percent:0;mso-height-percent:0;mso-left-percent:-10001;mso-top-percent:-10001;v-text-anchor:top" filled="f">
             <o:lock v:ext="edit" rotation="t" aspectratio="t" verticies="t" text="t" shapetype="t"/>
             <w10:anchorlock/>
@@ -3402,6 +3384,7 @@
           <w:kern w:val="0"/>
           <w14:ligatures w14:val="none"/>
         </w:rPr>
+        <w:lastRenderedPageBreak/>
         <w:t>Store LOW-impact flags for Densification Menu</w:t>
       </w:r>
     </w:p>
@@ -3444,7 +3427,6 @@
           <w:kern w:val="0"/>
           <w14:ligatures w14:val="none"/>
         </w:rPr>
-        <w:lastRenderedPageBreak/>
         <w:t>JUSTIFICATION REQUIREMENT FOR DECLINING HIGH-IMPACT FLAGS:</w:t>
       </w:r>
     </w:p>
@@ -3690,7 +3672,7 @@
         </w:rPr>
       </w:pPr>
       <w:r>
-        <w:pict w14:anchorId="67DA5B84">
+        <w:pict w14:anchorId="3682DDE8">
           <v:rect id="Horizontal Line 9" o:spid="_x0000_s1049" alt="" style="width:468pt;height:.05pt;visibility:visible;mso-wrap-style:square;mso-width-percent:0;mso-height-percent:0;mso-left-percent:-10001;mso-top-percent:-10001;mso-position-horizontal:absolute;mso-position-horizontal-relative:char;mso-position-vertical:absolute;mso-position-vertical-relative:line;mso-width-percent:0;mso-height-percent:0;mso-left-percent:-10001;mso-top-percent:-10001;v-text-anchor:top" filled="f">
             <o:lock v:ext="edit" rotation="t" aspectratio="t" verticies="t" text="t" shapetype="t"/>
             <w10:anchorlock/>
@@ -4101,6 +4083,7 @@
           <w:szCs w:val="20"/>
           <w14:ligatures w14:val="none"/>
         </w:rPr>
+        <w:lastRenderedPageBreak/>
         <w:t>Role: [Role Name]</w:t>
       </w:r>
     </w:p>
@@ -4171,7 +4154,6 @@
           <w:szCs w:val="20"/>
           <w14:ligatures w14:val="none"/>
         </w:rPr>
-        <w:lastRenderedPageBreak/>
         <w:t>| Bullet | Metrics Used | Outcomes Claimed | Named Entities | Scale Indicators |</w:t>
       </w:r>
     </w:p>
@@ -4765,7 +4747,7 @@
         </w:rPr>
       </w:pPr>
       <w:r>
-        <w:pict w14:anchorId="3988B730">
+        <w:pict w14:anchorId="37A77B98">
           <v:rect id="Horizontal Line 10" o:spid="_x0000_s1048" alt="" style="width:468pt;height:.05pt;visibility:visible;mso-wrap-style:square;mso-width-percent:0;mso-height-percent:0;mso-left-percent:-10001;mso-top-percent:-10001;mso-position-horizontal:absolute;mso-position-horizontal-relative:char;mso-position-vertical:absolute;mso-position-vertical-relative:line;mso-width-percent:0;mso-height-percent:0;mso-left-percent:-10001;mso-top-percent:-10001;v-text-anchor:top" filled="f">
             <o:lock v:ext="edit" rotation="t" aspectratio="t" verticies="t" text="t" shapetype="t"/>
             <w10:anchorlock/>
@@ -5394,6 +5376,7 @@
           <w:kern w:val="0"/>
           <w14:ligatures w14:val="none"/>
         </w:rPr>
+        <w:lastRenderedPageBreak/>
         <w:t>Extract the underlying fact (what happened, what was overcome, what resulted)</w:t>
       </w:r>
     </w:p>
@@ -5416,7 +5399,6 @@
           <w:kern w:val="0"/>
           <w14:ligatures w14:val="none"/>
         </w:rPr>
-        <w:lastRenderedPageBreak/>
         <w:t>Propose professional alternative phrasing</w:t>
       </w:r>
     </w:p>
@@ -5984,7 +5966,7 @@
         </w:rPr>
       </w:pPr>
       <w:r>
-        <w:pict w14:anchorId="6EB86B59">
+        <w:pict w14:anchorId="2E26DB3C">
           <v:rect id="Horizontal Line 11" o:spid="_x0000_s1047" alt="" style="width:468pt;height:.05pt;visibility:visible;mso-wrap-style:square;mso-width-percent:0;mso-height-percent:0;mso-left-percent:-10001;mso-top-percent:-10001;mso-position-horizontal:absolute;mso-position-horizontal-relative:char;mso-position-vertical:absolute;mso-position-vertical-relative:line;mso-width-percent:0;mso-height-percent:0;mso-left-percent:-10001;mso-top-percent:-10001;v-text-anchor:top" filled="f">
             <o:lock v:ext="edit" rotation="t" aspectratio="t" verticies="t" text="t" shapetype="t"/>
             <w10:anchorlock/>
@@ -7948,7 +7930,7 @@
         </w:rPr>
       </w:pPr>
       <w:r>
-        <w:pict w14:anchorId="427B3EDA">
+        <w:pict w14:anchorId="6BC8BB15">
           <v:rect id="Horizontal Line 12" o:spid="_x0000_s1046" alt="" style="width:468pt;height:.05pt;visibility:visible;mso-wrap-style:square;mso-width-percent:0;mso-height-percent:0;mso-left-percent:-10001;mso-top-percent:-10001;mso-position-horizontal:absolute;mso-position-horizontal-relative:char;mso-position-vertical:absolute;mso-position-vertical-relative:line;mso-width-percent:0;mso-height-percent:0;mso-left-percent:-10001;mso-top-percent:-10001;v-text-anchor:top" filled="f">
             <o:lock v:ext="edit" rotation="t" aspectratio="t" verticies="t" text="t" shapetype="t"/>
             <w10:anchorlock/>
@@ -9786,7 +9768,7 @@
         </w:rPr>
       </w:pPr>
       <w:r>
-        <w:pict w14:anchorId="372D3700">
+        <w:pict w14:anchorId="6F0949AC">
           <v:rect id="Horizontal Line 13" o:spid="_x0000_s1045" alt="" style="width:468pt;height:.05pt;visibility:visible;mso-wrap-style:square;mso-width-percent:0;mso-height-percent:0;mso-left-percent:-10001;mso-top-percent:-10001;mso-position-horizontal:absolute;mso-position-horizontal-relative:char;mso-position-vertical:absolute;mso-position-vertical-relative:line;mso-width-percent:0;mso-height-percent:0;mso-left-percent:-10001;mso-top-percent:-10001;v-text-anchor:top" filled="f">
             <o:lock v:ext="edit" rotation="t" aspectratio="t" verticies="t" text="t" shapetype="t"/>
             <w10:anchorlock/>
@@ -10408,7 +10390,7 @@
         </w:rPr>
       </w:pPr>
       <w:r>
-        <w:pict w14:anchorId="5A78102A">
+        <w:pict w14:anchorId="1B903D89">
           <v:rect id="Horizontal Line 14" o:spid="_x0000_s1044" alt="" style="width:468pt;height:.05pt;visibility:visible;mso-wrap-style:square;mso-width-percent:0;mso-height-percent:0;mso-left-percent:-10001;mso-top-percent:-10001;mso-position-horizontal:absolute;mso-position-horizontal-relative:char;mso-position-vertical:absolute;mso-position-vertical-relative:line;mso-width-percent:0;mso-height-percent:0;mso-left-percent:-10001;mso-top-percent:-10001;v-text-anchor:top" filled="f">
             <o:lock v:ext="edit" rotation="t" aspectratio="t" verticies="t" text="t" shapetype="t"/>
             <w10:anchorlock/>
@@ -10544,7 +10526,7 @@
         </w:rPr>
       </w:pPr>
       <w:r>
-        <w:pict w14:anchorId="684EA190">
+        <w:pict w14:anchorId="556551A5">
           <v:rect id="Horizontal Line 15" o:spid="_x0000_s1043" alt="" style="width:468pt;height:.05pt;visibility:visible;mso-wrap-style:square;mso-width-percent:0;mso-height-percent:0;mso-left-percent:-10001;mso-top-percent:-10001;mso-position-horizontal:absolute;mso-position-horizontal-relative:char;mso-position-vertical:absolute;mso-position-vertical-relative:line;mso-width-percent:0;mso-height-percent:0;mso-left-percent:-10001;mso-top-percent:-10001;v-text-anchor:top" filled="f">
             <o:lock v:ext="edit" rotation="t" aspectratio="t" verticies="t" text="t" shapetype="t"/>
             <w10:anchorlock/>
@@ -11252,7 +11234,7 @@
         </w:rPr>
       </w:pPr>
       <w:r>
-        <w:pict w14:anchorId="086A22B3">
+        <w:pict w14:anchorId="5C10E375">
           <v:rect id="Horizontal Line 16" o:spid="_x0000_s1042" alt="" style="width:468pt;height:.05pt;visibility:visible;mso-wrap-style:square;mso-width-percent:0;mso-height-percent:0;mso-left-percent:-10001;mso-top-percent:-10001;mso-position-horizontal:absolute;mso-position-horizontal-relative:char;mso-position-vertical:absolute;mso-position-vertical-relative:line;mso-width-percent:0;mso-height-percent:0;mso-left-percent:-10001;mso-top-percent:-10001;v-text-anchor:top" filled="f">
             <o:lock v:ext="edit" rotation="t" aspectratio="t" verticies="t" text="t" shapetype="t"/>
             <w10:anchorlock/>
@@ -12671,7 +12653,7 @@
         </w:rPr>
       </w:pPr>
       <w:r>
-        <w:pict w14:anchorId="471E0F3E">
+        <w:pict w14:anchorId="7870C5D6">
           <v:rect id="Horizontal Line 17" o:spid="_x0000_s1041" alt="" style="width:468pt;height:.05pt;visibility:visible;mso-wrap-style:square;mso-width-percent:0;mso-height-percent:0;mso-left-percent:-10001;mso-top-percent:-10001;mso-position-horizontal:absolute;mso-position-horizontal-relative:char;mso-position-vertical:absolute;mso-position-vertical-relative:line;mso-width-percent:0;mso-height-percent:0;mso-left-percent:-10001;mso-top-percent:-10001;v-text-anchor:top" filled="f">
             <o:lock v:ext="edit" rotation="t" aspectratio="t" verticies="t" text="t" shapetype="t"/>
             <w10:anchorlock/>
@@ -15170,7 +15152,7 @@
         </w:rPr>
       </w:pPr>
       <w:r>
-        <w:pict w14:anchorId="535A40EE">
+        <w:pict w14:anchorId="7DCB9479">
           <v:rect id="Horizontal Line 18" o:spid="_x0000_s1040" alt="" style="width:468pt;height:.05pt;visibility:visible;mso-wrap-style:square;mso-width-percent:0;mso-height-percent:0;mso-left-percent:-10001;mso-top-percent:-10001;mso-position-horizontal:absolute;mso-position-horizontal-relative:char;mso-position-vertical:absolute;mso-position-vertical-relative:line;mso-width-percent:0;mso-height-percent:0;mso-left-percent:-10001;mso-top-percent:-10001;v-text-anchor:top" filled="f">
             <o:lock v:ext="edit" rotation="t" aspectratio="t" verticies="t" text="t" shapetype="t"/>
             <w10:anchorlock/>
@@ -15437,7 +15419,7 @@
     </w:p>
     <w:p>
       <w:r>
-        <w:t>Now executing: -&gt; Step 2a (if triggered) + Step 3: D2 Generation + Step 3a: Gate 8 Proofreading</w:t>
+        <w:t>Now executing: -&gt; Step 2a (if triggered) + Step 3: D2 Generation + Step 3a: Gate 8 Proofreading + Step 3b: Harness Run B</w:t>
       </w:r>
     </w:p>
     <w:p>
@@ -15770,7 +15752,7 @@
         </w:rPr>
       </w:pPr>
       <w:r>
-        <w:pict w14:anchorId="0DCF7898">
+        <w:pict w14:anchorId="03EBF174">
           <v:rect id="Horizontal Line 19" o:spid="_x0000_s1039" alt="" style="width:468pt;height:.05pt;visibility:visible;mso-wrap-style:square;mso-width-percent:0;mso-height-percent:0;mso-left-percent:-10001;mso-top-percent:-10001;mso-position-horizontal:absolute;mso-position-horizontal-relative:char;mso-position-vertical:absolute;mso-position-vertical-relative:line;mso-width-percent:0;mso-height-percent:0;mso-left-percent:-10001;mso-top-percent:-10001;v-text-anchor:top" filled="f">
             <o:lock v:ext="edit" rotation="t" aspectratio="t" verticies="t" text="t" shapetype="t"/>
             <w10:anchorlock/>
@@ -17979,7 +17961,7 @@
         </w:rPr>
       </w:pPr>
       <w:r>
-        <w:pict w14:anchorId="6C787F48">
+        <w:pict w14:anchorId="25E90A34">
           <v:rect id="Horizontal Line 20" o:spid="_x0000_s1038" alt="" style="width:468pt;height:.05pt;visibility:visible;mso-wrap-style:square;mso-width-percent:0;mso-height-percent:0;mso-left-percent:-10001;mso-top-percent:-10001;mso-position-horizontal:absolute;mso-position-horizontal-relative:char;mso-position-vertical:absolute;mso-position-vertical-relative:line;mso-width-percent:0;mso-height-percent:0;mso-left-percent:-10001;mso-top-percent:-10001;v-text-anchor:top" filled="f">
             <o:lock v:ext="edit" rotation="t" aspectratio="t" verticies="t" text="t" shapetype="t"/>
             <w10:anchorlock/>
@@ -18284,7 +18266,7 @@
         </w:rPr>
       </w:pPr>
       <w:r>
-        <w:pict w14:anchorId="60AEFB72">
+        <w:pict w14:anchorId="656B8866">
           <v:rect id="Horizontal Line 21" o:spid="_x0000_s1037" alt="" style="width:468pt;height:.05pt;visibility:visible;mso-wrap-style:square;mso-width-percent:0;mso-height-percent:0;mso-left-percent:-10001;mso-top-percent:-10001;mso-position-horizontal:absolute;mso-position-horizontal-relative:char;mso-position-vertical:absolute;mso-position-vertical-relative:line;mso-width-percent:0;mso-height-percent:0;mso-left-percent:-10001;mso-top-percent:-10001;v-text-anchor:top" filled="f">
             <o:lock v:ext="edit" rotation="t" aspectratio="t" verticies="t" text="t" shapetype="t"/>
             <w10:anchorlock/>
@@ -19933,7 +19915,7 @@
         </w:rPr>
       </w:pPr>
       <w:r>
-        <w:pict w14:anchorId="5DEB8EAB">
+        <w:pict w14:anchorId="14826F08">
           <v:rect id="Horizontal Line 22" o:spid="_x0000_s1036" alt="" style="width:468pt;height:.05pt;visibility:visible;mso-wrap-style:square;mso-width-percent:0;mso-height-percent:0;mso-left-percent:-10001;mso-top-percent:-10001;mso-position-horizontal:absolute;mso-position-horizontal-relative:char;mso-position-vertical:absolute;mso-position-vertical-relative:line;mso-width-percent:0;mso-height-percent:0;mso-left-percent:-10001;mso-top-percent:-10001;v-text-anchor:top" filled="f">
             <o:lock v:ext="edit" rotation="t" aspectratio="t" verticies="t" text="t" shapetype="t"/>
             <w10:anchorlock/>
@@ -22262,7 +22244,7 @@
         </w:rPr>
       </w:pPr>
       <w:r>
-        <w:pict w14:anchorId="4DB21E5F">
+        <w:pict w14:anchorId="64CE35EE">
           <v:rect id="Horizontal Line 23" o:spid="_x0000_s1035" alt="" style="width:468pt;height:.05pt;visibility:visible;mso-wrap-style:square;mso-width-percent:0;mso-height-percent:0;mso-left-percent:-10001;mso-top-percent:-10001;mso-position-horizontal:absolute;mso-position-horizontal-relative:char;mso-position-vertical:absolute;mso-position-vertical-relative:line;mso-width-percent:0;mso-height-percent:0;mso-left-percent:-10001;mso-top-percent:-10001;v-text-anchor:top" filled="f">
             <o:lock v:ext="edit" rotation="t" aspectratio="t" verticies="t" text="t" shapetype="t"/>
             <w10:anchorlock/>
@@ -23319,7 +23301,7 @@
         </w:rPr>
       </w:pPr>
       <w:r>
-        <w:pict w14:anchorId="325B1E03">
+        <w:pict w14:anchorId="6F55BF0A">
           <v:rect id="Horizontal Line 24" o:spid="_x0000_s1034" alt="" style="width:468pt;height:.05pt;visibility:visible;mso-wrap-style:square;mso-width-percent:0;mso-height-percent:0;mso-left-percent:-10001;mso-top-percent:-10001;mso-position-horizontal:absolute;mso-position-horizontal-relative:char;mso-position-vertical:absolute;mso-position-vertical-relative:line;mso-width-percent:0;mso-height-percent:0;mso-left-percent:-10001;mso-top-percent:-10001;v-text-anchor:top" filled="f">
             <o:lock v:ext="edit" rotation="t" aspectratio="t" verticies="t" text="t" shapetype="t"/>
             <w10:anchorlock/>
@@ -23846,7 +23828,7 @@
         </w:rPr>
       </w:pPr>
       <w:r>
-        <w:pict w14:anchorId="26C9B108">
+        <w:pict w14:anchorId="7AE6C8C0">
           <v:rect id="Horizontal Line 25" o:spid="_x0000_s1033" alt="" style="width:468pt;height:.05pt;visibility:visible;mso-wrap-style:square;mso-width-percent:0;mso-height-percent:0;mso-left-percent:-10001;mso-top-percent:-10001;mso-position-horizontal:absolute;mso-position-horizontal-relative:char;mso-position-vertical:absolute;mso-position-vertical-relative:line;mso-width-percent:0;mso-height-percent:0;mso-left-percent:-10001;mso-top-percent:-10001;v-text-anchor:top" filled="f">
             <o:lock v:ext="edit" rotation="t" aspectratio="t" verticies="t" text="t" shapetype="t"/>
             <w10:anchorlock/>
@@ -24775,7 +24757,7 @@
         </w:rPr>
       </w:pPr>
       <w:r>
-        <w:pict w14:anchorId="2421D1BF">
+        <w:pict w14:anchorId="3023B2CD">
           <v:rect id="Horizontal Line 26" o:spid="_x0000_s1032" alt="" style="width:468pt;height:.05pt;visibility:visible;mso-wrap-style:square;mso-width-percent:0;mso-height-percent:0;mso-left-percent:-10001;mso-top-percent:-10001;mso-position-horizontal:absolute;mso-position-horizontal-relative:char;mso-position-vertical:absolute;mso-position-vertical-relative:line;mso-width-percent:0;mso-height-percent:0;mso-left-percent:-10001;mso-top-percent:-10001;v-text-anchor:top" filled="f">
             <o:lock v:ext="edit" rotation="t" aspectratio="t" verticies="t" text="t" shapetype="t"/>
             <w10:anchorlock/>
@@ -25723,7 +25705,7 @@
         </w:rPr>
       </w:pPr>
       <w:r>
-        <w:pict w14:anchorId="516B2E14">
+        <w:pict w14:anchorId="19369945">
           <v:rect id="Horizontal Line 27" o:spid="_x0000_s1031" alt="" style="width:468pt;height:.05pt;visibility:visible;mso-wrap-style:square;mso-width-percent:0;mso-height-percent:0;mso-left-percent:-10001;mso-top-percent:-10001;mso-position-horizontal:absolute;mso-position-horizontal-relative:char;mso-position-vertical:absolute;mso-position-vertical-relative:line;mso-width-percent:0;mso-height-percent:0;mso-left-percent:-10001;mso-top-percent:-10001;v-text-anchor:top" filled="f">
             <o:lock v:ext="edit" rotation="t" aspectratio="t" verticies="t" text="t" shapetype="t"/>
             <w10:anchorlock/>
@@ -26096,86 +26078,6 @@
                 <w:kern w:val="0"/>
                 <w14:ligatures w14:val="none"/>
               </w:rPr>
-              <w:t>Repeated words</w:t>
-            </w:r>
-          </w:p>
-        </w:tc>
-        <w:tc>
-          <w:tcPr>
-            <w:tcW w:w="0" w:type="auto"/>
-            <w:vAlign w:val="center"/>
-            <w:hideMark/>
-          </w:tcPr>
-          <w:p>
-            <w:pPr>
-              <w:spacing w:after="0" w:line="240" w:lineRule="auto"/>
-              <w:rPr>
-                <w:rFonts w:ascii="Times New Roman" w:eastAsia="Times New Roman" w:hAnsi="Times New Roman" w:cs="Times New Roman"/>
-                <w:kern w:val="0"/>
-                <w14:ligatures w14:val="none"/>
-              </w:rPr>
-            </w:pPr>
-            <w:r>
-              <w:rPr>
-                <w:rFonts w:ascii="Times New Roman" w:eastAsia="Times New Roman" w:hAnsi="Times New Roman" w:cs="Times New Roman"/>
-                <w:kern w:val="0"/>
-                <w14:ligatures w14:val="none"/>
-              </w:rPr>
-              <w:t>"achieving achieving", "the the"</w:t>
-            </w:r>
-          </w:p>
-        </w:tc>
-        <w:tc>
-          <w:tcPr>
-            <w:tcW w:w="0" w:type="auto"/>
-            <w:vAlign w:val="center"/>
-            <w:hideMark/>
-          </w:tcPr>
-          <w:p>
-            <w:pPr>
-              <w:spacing w:after="0" w:line="240" w:lineRule="auto"/>
-              <w:rPr>
-                <w:rFonts w:ascii="Times New Roman" w:eastAsia="Times New Roman" w:hAnsi="Times New Roman" w:cs="Times New Roman"/>
-                <w:kern w:val="0"/>
-                <w14:ligatures w14:val="none"/>
-              </w:rPr>
-            </w:pPr>
-            <w:r>
-              <w:rPr>
-                <w:rFonts w:ascii="Times New Roman" w:eastAsia="Times New Roman" w:hAnsi="Times New Roman" w:cs="Times New Roman"/>
-                <w:kern w:val="0"/>
-                <w14:ligatures w14:val="none"/>
-              </w:rPr>
-              <w:t>Remove duplicate</w:t>
-            </w:r>
-          </w:p>
-        </w:tc>
-      </w:tr>
-      <w:tr>
-        <w:trPr>
-          <w:tblCellSpacing w:w="15" w:type="dxa"/>
-        </w:trPr>
-        <w:tc>
-          <w:tcPr>
-            <w:tcW w:w="0" w:type="auto"/>
-            <w:vAlign w:val="center"/>
-            <w:hideMark/>
-          </w:tcPr>
-          <w:p>
-            <w:pPr>
-              <w:spacing w:after="0" w:line="240" w:lineRule="auto"/>
-              <w:rPr>
-                <w:rFonts w:ascii="Times New Roman" w:eastAsia="Times New Roman" w:hAnsi="Times New Roman" w:cs="Times New Roman"/>
-                <w:kern w:val="0"/>
-                <w14:ligatures w14:val="none"/>
-              </w:rPr>
-            </w:pPr>
-            <w:r>
-              <w:rPr>
-                <w:rFonts w:ascii="Times New Roman" w:eastAsia="Times New Roman" w:hAnsi="Times New Roman" w:cs="Times New Roman"/>
-                <w:kern w:val="0"/>
-                <w14:ligatures w14:val="none"/>
-              </w:rPr>
               <w:t>Inconsistent date format</w:t>
             </w:r>
           </w:p>
@@ -26404,12 +26306,30 @@
       <w:r>
         <w:rPr>
           <w:rFonts w:ascii="Times New Roman" w:eastAsia="Times New Roman" w:hAnsi="Times New Roman" w:cs="Times New Roman"/>
+          <w:kern w:val="0"/>
+          <w14:ligatures w14:val="none"/>
+        </w:rPr>
+        <w:lastRenderedPageBreak/>
+        <w:t>SCOPE: Dashes and repeated words are enforced mechanically by Harness Run B (Step 3b). Gate 8 covers judgment items only: typos, punctuation placement, header date-format consistency, spacing, and orphaned characters.</w:t>
+      </w:r>
+    </w:p>
+    <w:p>
+      <w:pPr>
+        <w:spacing w:before="100" w:beforeAutospacing="1" w:after="100" w:afterAutospacing="1" w:line="240" w:lineRule="auto"/>
+        <w:rPr>
+          <w:rFonts w:ascii="Times New Roman" w:eastAsia="Times New Roman" w:hAnsi="Times New Roman" w:cs="Times New Roman"/>
+          <w:kern w:val="0"/>
+          <w14:ligatures w14:val="none"/>
+        </w:rPr>
+      </w:pPr>
+      <w:r>
+        <w:rPr>
+          <w:rFonts w:ascii="Times New Roman" w:eastAsia="Times New Roman" w:hAnsi="Times New Roman" w:cs="Times New Roman"/>
           <w:b/>
           <w:bCs/>
           <w:kern w:val="0"/>
           <w14:ligatures w14:val="none"/>
         </w:rPr>
-        <w:lastRenderedPageBreak/>
         <w:t>STANDARD FORMATS:</w:t>
       </w:r>
     </w:p>
@@ -26708,46 +26628,6 @@
           <w:szCs w:val="20"/>
           <w14:ligatures w14:val="none"/>
         </w:rPr>
-        <w:t>Repeated words: [NONE FOUND / FOUND AND FIXED: list]</w:t>
-      </w:r>
-    </w:p>
-    <w:p>
-      <w:pPr>
-        <w:tabs>
-          <w:tab w:val="left" w:pos="916"/>
-          <w:tab w:val="left" w:pos="1832"/>
-          <w:tab w:val="left" w:pos="2748"/>
-          <w:tab w:val="left" w:pos="3664"/>
-          <w:tab w:val="left" w:pos="4580"/>
-          <w:tab w:val="left" w:pos="5496"/>
-          <w:tab w:val="left" w:pos="6412"/>
-          <w:tab w:val="left" w:pos="7328"/>
-          <w:tab w:val="left" w:pos="8244"/>
-          <w:tab w:val="left" w:pos="9160"/>
-          <w:tab w:val="left" w:pos="10076"/>
-          <w:tab w:val="left" w:pos="10992"/>
-          <w:tab w:val="left" w:pos="11908"/>
-          <w:tab w:val="left" w:pos="12824"/>
-          <w:tab w:val="left" w:pos="13740"/>
-          <w:tab w:val="left" w:pos="14656"/>
-        </w:tabs>
-        <w:spacing w:after="0" w:line="240" w:lineRule="auto"/>
-        <w:rPr>
-          <w:rFonts w:ascii="Courier New" w:eastAsia="Times New Roman" w:hAnsi="Courier New" w:cs="Courier New"/>
-          <w:kern w:val="0"/>
-          <w:sz w:val="20"/>
-          <w:szCs w:val="20"/>
-          <w14:ligatures w14:val="none"/>
-        </w:rPr>
-      </w:pPr>
-      <w:r>
-        <w:rPr>
-          <w:rFonts w:ascii="Courier New" w:eastAsia="Times New Roman" w:hAnsi="Courier New" w:cs="Courier New"/>
-          <w:kern w:val="0"/>
-          <w:sz w:val="20"/>
-          <w:szCs w:val="20"/>
-          <w14:ligatures w14:val="none"/>
-        </w:rPr>
         <w:t>Date format: [CONSISTENT / STANDARDIZED: list changes]</w:t>
       </w:r>
     </w:p>
@@ -26891,7 +26771,7 @@
         </w:rPr>
       </w:pPr>
       <w:r>
-        <w:pict w14:anchorId="79F5AB48">
+        <w:pict w14:anchorId="1E26E5D7">
           <v:rect id="Horizontal Line 28" o:spid="_x0000_s1030" alt="" style="width:468pt;height:.05pt;visibility:visible;mso-wrap-style:square;mso-width-percent:0;mso-height-percent:0;mso-left-percent:-10001;mso-top-percent:-10001;mso-position-horizontal:absolute;mso-position-horizontal-relative:char;mso-position-vertical:absolute;mso-position-vertical-relative:line;mso-width-percent:0;mso-height-percent:0;mso-left-percent:-10001;mso-top-percent:-10001;v-text-anchor:top" filled="f">
             <o:lock v:ext="edit" rotation="t" aspectratio="t" verticies="t" text="t" shapetype="t"/>
             <w10:anchorlock/>
@@ -26923,7 +26803,7 @@
           <w:szCs w:val="27"/>
           <w14:ligatures w14:val="none"/>
         </w:rPr>
-        <w:t>Step 4: ATS Confidence Score</w:t>
+        <w:t>Step 3b: HARNESS RUN B (MANDATORY — final-text verification)</w:t>
       </w:r>
     </w:p>
     <w:p>
@@ -26941,647 +26821,61 @@
           <w:kern w:val="0"/>
           <w14:ligatures w14:val="none"/>
         </w:rPr>
-        <w:t>Calculate and display:</w:t>
-      </w:r>
-    </w:p>
-    <w:p>
-      <w:pPr>
-        <w:tabs>
-          <w:tab w:val="left" w:pos="916"/>
-          <w:tab w:val="left" w:pos="1832"/>
-          <w:tab w:val="left" w:pos="2748"/>
-          <w:tab w:val="left" w:pos="3664"/>
-          <w:tab w:val="left" w:pos="4580"/>
-          <w:tab w:val="left" w:pos="5496"/>
-          <w:tab w:val="left" w:pos="6412"/>
-          <w:tab w:val="left" w:pos="7328"/>
-          <w:tab w:val="left" w:pos="8244"/>
-          <w:tab w:val="left" w:pos="9160"/>
-          <w:tab w:val="left" w:pos="10076"/>
-          <w:tab w:val="left" w:pos="10992"/>
-          <w:tab w:val="left" w:pos="11908"/>
-          <w:tab w:val="left" w:pos="12824"/>
-          <w:tab w:val="left" w:pos="13740"/>
-          <w:tab w:val="left" w:pos="14656"/>
-        </w:tabs>
-        <w:spacing w:after="0" w:line="240" w:lineRule="auto"/>
-        <w:rPr>
-          <w:rFonts w:ascii="Courier New" w:eastAsia="Times New Roman" w:hAnsi="Courier New" w:cs="Courier New"/>
-          <w:kern w:val="0"/>
-          <w:sz w:val="20"/>
-          <w:szCs w:val="20"/>
-          <w14:ligatures w14:val="none"/>
-        </w:rPr>
-      </w:pPr>
-      <w:r>
-        <w:rPr>
-          <w:rFonts w:ascii="Courier New" w:eastAsia="Times New Roman" w:hAnsi="Courier New" w:cs="Courier New"/>
-          <w:kern w:val="0"/>
-          <w:sz w:val="20"/>
-          <w:szCs w:val="20"/>
-          <w14:ligatures w14:val="none"/>
-        </w:rPr>
-        <w:t>**ATS CONFIDENCE: [HIGH / MEDIUM / LOW]**</w:t>
-      </w:r>
-    </w:p>
-    <w:p>
-      <w:pPr>
-        <w:tabs>
-          <w:tab w:val="left" w:pos="916"/>
-          <w:tab w:val="left" w:pos="1832"/>
-          <w:tab w:val="left" w:pos="2748"/>
-          <w:tab w:val="left" w:pos="3664"/>
-          <w:tab w:val="left" w:pos="4580"/>
-          <w:tab w:val="left" w:pos="5496"/>
-          <w:tab w:val="left" w:pos="6412"/>
-          <w:tab w:val="left" w:pos="7328"/>
-          <w:tab w:val="left" w:pos="8244"/>
-          <w:tab w:val="left" w:pos="9160"/>
-          <w:tab w:val="left" w:pos="10076"/>
-          <w:tab w:val="left" w:pos="10992"/>
-          <w:tab w:val="left" w:pos="11908"/>
-          <w:tab w:val="left" w:pos="12824"/>
-          <w:tab w:val="left" w:pos="13740"/>
-          <w:tab w:val="left" w:pos="14656"/>
-        </w:tabs>
-        <w:spacing w:after="0" w:line="240" w:lineRule="auto"/>
-        <w:rPr>
-          <w:rFonts w:ascii="Courier New" w:eastAsia="Times New Roman" w:hAnsi="Courier New" w:cs="Courier New"/>
-          <w:kern w:val="0"/>
-          <w:sz w:val="20"/>
-          <w:szCs w:val="20"/>
-          <w14:ligatures w14:val="none"/>
-        </w:rPr>
-      </w:pPr>
-    </w:p>
-    <w:p>
-      <w:pPr>
-        <w:tabs>
-          <w:tab w:val="left" w:pos="916"/>
-          <w:tab w:val="left" w:pos="1832"/>
-          <w:tab w:val="left" w:pos="2748"/>
-          <w:tab w:val="left" w:pos="3664"/>
-          <w:tab w:val="left" w:pos="4580"/>
-          <w:tab w:val="left" w:pos="5496"/>
-          <w:tab w:val="left" w:pos="6412"/>
-          <w:tab w:val="left" w:pos="7328"/>
-          <w:tab w:val="left" w:pos="8244"/>
-          <w:tab w:val="left" w:pos="9160"/>
-          <w:tab w:val="left" w:pos="10076"/>
-          <w:tab w:val="left" w:pos="10992"/>
-          <w:tab w:val="left" w:pos="11908"/>
-          <w:tab w:val="left" w:pos="12824"/>
-          <w:tab w:val="left" w:pos="13740"/>
-          <w:tab w:val="left" w:pos="14656"/>
-        </w:tabs>
-        <w:spacing w:after="0" w:line="240" w:lineRule="auto"/>
-        <w:rPr>
-          <w:rFonts w:ascii="Courier New" w:eastAsia="Times New Roman" w:hAnsi="Courier New" w:cs="Courier New"/>
-          <w:kern w:val="0"/>
-          <w:sz w:val="20"/>
-          <w:szCs w:val="20"/>
-          <w14:ligatures w14:val="none"/>
-        </w:rPr>
-      </w:pPr>
-      <w:r>
-        <w:rPr>
-          <w:rFonts w:ascii="Courier New" w:eastAsia="Times New Roman" w:hAnsi="Courier New" w:cs="Courier New"/>
-          <w:kern w:val="0"/>
-          <w:sz w:val="20"/>
-          <w:szCs w:val="20"/>
-          <w14:ligatures w14:val="none"/>
-        </w:rPr>
-        <w:t>Criticals Coverage: [N] of [Total] ([Percentage]%)</w:t>
-      </w:r>
-    </w:p>
-    <w:p>
-      <w:pPr>
-        <w:tabs>
-          <w:tab w:val="left" w:pos="916"/>
-          <w:tab w:val="left" w:pos="1832"/>
-          <w:tab w:val="left" w:pos="2748"/>
-          <w:tab w:val="left" w:pos="3664"/>
-          <w:tab w:val="left" w:pos="4580"/>
-          <w:tab w:val="left" w:pos="5496"/>
-          <w:tab w:val="left" w:pos="6412"/>
-          <w:tab w:val="left" w:pos="7328"/>
-          <w:tab w:val="left" w:pos="8244"/>
-          <w:tab w:val="left" w:pos="9160"/>
-          <w:tab w:val="left" w:pos="10076"/>
-          <w:tab w:val="left" w:pos="10992"/>
-          <w:tab w:val="left" w:pos="11908"/>
-          <w:tab w:val="left" w:pos="12824"/>
-          <w:tab w:val="left" w:pos="13740"/>
-          <w:tab w:val="left" w:pos="14656"/>
-        </w:tabs>
-        <w:spacing w:after="0" w:line="240" w:lineRule="auto"/>
-        <w:rPr>
-          <w:rFonts w:ascii="Courier New" w:eastAsia="Times New Roman" w:hAnsi="Courier New" w:cs="Courier New"/>
-          <w:kern w:val="0"/>
-          <w:sz w:val="20"/>
-          <w:szCs w:val="20"/>
-          <w14:ligatures w14:val="none"/>
-        </w:rPr>
-      </w:pPr>
-      <w:r>
-        <w:rPr>
-          <w:rFonts w:ascii="Courier New" w:eastAsia="Times New Roman" w:hAnsi="Courier New" w:cs="Courier New"/>
-          <w:kern w:val="0"/>
-          <w:sz w:val="20"/>
-          <w:szCs w:val="20"/>
-          <w14:ligatures w14:val="none"/>
-        </w:rPr>
-        <w:t>- MUST requirements: [N] of [N] covered</w:t>
-      </w:r>
-    </w:p>
-    <w:p>
-      <w:pPr>
-        <w:tabs>
-          <w:tab w:val="left" w:pos="916"/>
-          <w:tab w:val="left" w:pos="1832"/>
-          <w:tab w:val="left" w:pos="2748"/>
-          <w:tab w:val="left" w:pos="3664"/>
-          <w:tab w:val="left" w:pos="4580"/>
-          <w:tab w:val="left" w:pos="5496"/>
-          <w:tab w:val="left" w:pos="6412"/>
-          <w:tab w:val="left" w:pos="7328"/>
-          <w:tab w:val="left" w:pos="8244"/>
-          <w:tab w:val="left" w:pos="9160"/>
-          <w:tab w:val="left" w:pos="10076"/>
-          <w:tab w:val="left" w:pos="10992"/>
-          <w:tab w:val="left" w:pos="11908"/>
-          <w:tab w:val="left" w:pos="12824"/>
-          <w:tab w:val="left" w:pos="13740"/>
-          <w:tab w:val="left" w:pos="14656"/>
-        </w:tabs>
-        <w:spacing w:after="0" w:line="240" w:lineRule="auto"/>
-        <w:rPr>
-          <w:rFonts w:ascii="Courier New" w:eastAsia="Times New Roman" w:hAnsi="Courier New" w:cs="Courier New"/>
-          <w:kern w:val="0"/>
-          <w:sz w:val="20"/>
-          <w:szCs w:val="20"/>
-          <w14:ligatures w14:val="none"/>
-        </w:rPr>
-      </w:pPr>
-      <w:r>
-        <w:rPr>
-          <w:rFonts w:ascii="Courier New" w:eastAsia="Times New Roman" w:hAnsi="Courier New" w:cs="Courier New"/>
-          <w:kern w:val="0"/>
-          <w:sz w:val="20"/>
-          <w:szCs w:val="20"/>
-          <w14:ligatures w14:val="none"/>
-        </w:rPr>
-        <w:t>- LIKELY_MUST: [N] of [N] covered</w:t>
-      </w:r>
-    </w:p>
-    <w:p>
-      <w:pPr>
-        <w:tabs>
-          <w:tab w:val="left" w:pos="916"/>
-          <w:tab w:val="left" w:pos="1832"/>
-          <w:tab w:val="left" w:pos="2748"/>
-          <w:tab w:val="left" w:pos="3664"/>
-          <w:tab w:val="left" w:pos="4580"/>
-          <w:tab w:val="left" w:pos="5496"/>
-          <w:tab w:val="left" w:pos="6412"/>
-          <w:tab w:val="left" w:pos="7328"/>
-          <w:tab w:val="left" w:pos="8244"/>
-          <w:tab w:val="left" w:pos="9160"/>
-          <w:tab w:val="left" w:pos="10076"/>
-          <w:tab w:val="left" w:pos="10992"/>
-          <w:tab w:val="left" w:pos="11908"/>
-          <w:tab w:val="left" w:pos="12824"/>
-          <w:tab w:val="left" w:pos="13740"/>
-          <w:tab w:val="left" w:pos="14656"/>
-        </w:tabs>
-        <w:spacing w:after="0" w:line="240" w:lineRule="auto"/>
-        <w:rPr>
-          <w:rFonts w:ascii="Courier New" w:eastAsia="Times New Roman" w:hAnsi="Courier New" w:cs="Courier New"/>
-          <w:kern w:val="0"/>
-          <w:sz w:val="20"/>
-          <w:szCs w:val="20"/>
-          <w14:ligatures w14:val="none"/>
-        </w:rPr>
-      </w:pPr>
-      <w:r>
-        <w:rPr>
-          <w:rFonts w:ascii="Courier New" w:eastAsia="Times New Roman" w:hAnsi="Courier New" w:cs="Courier New"/>
-          <w:kern w:val="0"/>
-          <w:sz w:val="20"/>
-          <w:szCs w:val="20"/>
-          <w14:ligatures w14:val="none"/>
-        </w:rPr>
-        <w:t>- ADVISORY: [N] of [N] covered</w:t>
-      </w:r>
-    </w:p>
-    <w:p>
-      <w:pPr>
-        <w:tabs>
-          <w:tab w:val="left" w:pos="916"/>
-          <w:tab w:val="left" w:pos="1832"/>
-          <w:tab w:val="left" w:pos="2748"/>
-          <w:tab w:val="left" w:pos="3664"/>
-          <w:tab w:val="left" w:pos="4580"/>
-          <w:tab w:val="left" w:pos="5496"/>
-          <w:tab w:val="left" w:pos="6412"/>
-          <w:tab w:val="left" w:pos="7328"/>
-          <w:tab w:val="left" w:pos="8244"/>
-          <w:tab w:val="left" w:pos="9160"/>
-          <w:tab w:val="left" w:pos="10076"/>
-          <w:tab w:val="left" w:pos="10992"/>
-          <w:tab w:val="left" w:pos="11908"/>
-          <w:tab w:val="left" w:pos="12824"/>
-          <w:tab w:val="left" w:pos="13740"/>
-          <w:tab w:val="left" w:pos="14656"/>
-        </w:tabs>
-        <w:spacing w:after="0" w:line="240" w:lineRule="auto"/>
-        <w:rPr>
-          <w:rFonts w:ascii="Courier New" w:eastAsia="Times New Roman" w:hAnsi="Courier New" w:cs="Courier New"/>
-          <w:kern w:val="0"/>
-          <w:sz w:val="20"/>
-          <w:szCs w:val="20"/>
-          <w14:ligatures w14:val="none"/>
-        </w:rPr>
-      </w:pPr>
-    </w:p>
-    <w:p>
-      <w:pPr>
-        <w:tabs>
-          <w:tab w:val="left" w:pos="916"/>
-          <w:tab w:val="left" w:pos="1832"/>
-          <w:tab w:val="left" w:pos="2748"/>
-          <w:tab w:val="left" w:pos="3664"/>
-          <w:tab w:val="left" w:pos="4580"/>
-          <w:tab w:val="left" w:pos="5496"/>
-          <w:tab w:val="left" w:pos="6412"/>
-          <w:tab w:val="left" w:pos="7328"/>
-          <w:tab w:val="left" w:pos="8244"/>
-          <w:tab w:val="left" w:pos="9160"/>
-          <w:tab w:val="left" w:pos="10076"/>
-          <w:tab w:val="left" w:pos="10992"/>
-          <w:tab w:val="left" w:pos="11908"/>
-          <w:tab w:val="left" w:pos="12824"/>
-          <w:tab w:val="left" w:pos="13740"/>
-          <w:tab w:val="left" w:pos="14656"/>
-        </w:tabs>
-        <w:spacing w:after="0" w:line="240" w:lineRule="auto"/>
-        <w:rPr>
-          <w:rFonts w:ascii="Courier New" w:eastAsia="Times New Roman" w:hAnsi="Courier New" w:cs="Courier New"/>
-          <w:kern w:val="0"/>
-          <w:sz w:val="20"/>
-          <w:szCs w:val="20"/>
-          <w14:ligatures w14:val="none"/>
-        </w:rPr>
-      </w:pPr>
-      <w:r>
-        <w:rPr>
-          <w:rFonts w:ascii="Courier New" w:eastAsia="Times New Roman" w:hAnsi="Courier New" w:cs="Courier New"/>
-          <w:kern w:val="0"/>
-          <w:sz w:val="20"/>
-          <w:szCs w:val="20"/>
-          <w14:ligatures w14:val="none"/>
-        </w:rPr>
-        <w:t>Exact Phrase Placement:</w:t>
-      </w:r>
-    </w:p>
-    <w:p>
-      <w:pPr>
-        <w:tabs>
-          <w:tab w:val="left" w:pos="916"/>
-          <w:tab w:val="left" w:pos="1832"/>
-          <w:tab w:val="left" w:pos="2748"/>
-          <w:tab w:val="left" w:pos="3664"/>
-          <w:tab w:val="left" w:pos="4580"/>
-          <w:tab w:val="left" w:pos="5496"/>
-          <w:tab w:val="left" w:pos="6412"/>
-          <w:tab w:val="left" w:pos="7328"/>
-          <w:tab w:val="left" w:pos="8244"/>
-          <w:tab w:val="left" w:pos="9160"/>
-          <w:tab w:val="left" w:pos="10076"/>
-          <w:tab w:val="left" w:pos="10992"/>
-          <w:tab w:val="left" w:pos="11908"/>
-          <w:tab w:val="left" w:pos="12824"/>
-          <w:tab w:val="left" w:pos="13740"/>
-          <w:tab w:val="left" w:pos="14656"/>
-        </w:tabs>
-        <w:spacing w:after="0" w:line="240" w:lineRule="auto"/>
-        <w:rPr>
-          <w:rFonts w:ascii="Courier New" w:eastAsia="Times New Roman" w:hAnsi="Courier New" w:cs="Courier New"/>
-          <w:kern w:val="0"/>
-          <w:sz w:val="20"/>
-          <w:szCs w:val="20"/>
-          <w14:ligatures w14:val="none"/>
-        </w:rPr>
-      </w:pPr>
-      <w:r>
-        <w:rPr>
-          <w:rFonts w:ascii="Courier New" w:eastAsia="Times New Roman" w:hAnsi="Courier New" w:cs="Courier New"/>
-          <w:kern w:val="0"/>
-          <w:sz w:val="20"/>
-          <w:szCs w:val="20"/>
-          <w14:ligatures w14:val="none"/>
-        </w:rPr>
-        <w:t>- Summary: [N] exacts</w:t>
-      </w:r>
-    </w:p>
-    <w:p>
-      <w:pPr>
-        <w:tabs>
-          <w:tab w:val="left" w:pos="916"/>
-          <w:tab w:val="left" w:pos="1832"/>
-          <w:tab w:val="left" w:pos="2748"/>
-          <w:tab w:val="left" w:pos="3664"/>
-          <w:tab w:val="left" w:pos="4580"/>
-          <w:tab w:val="left" w:pos="5496"/>
-          <w:tab w:val="left" w:pos="6412"/>
-          <w:tab w:val="left" w:pos="7328"/>
-          <w:tab w:val="left" w:pos="8244"/>
-          <w:tab w:val="left" w:pos="9160"/>
-          <w:tab w:val="left" w:pos="10076"/>
-          <w:tab w:val="left" w:pos="10992"/>
-          <w:tab w:val="left" w:pos="11908"/>
-          <w:tab w:val="left" w:pos="12824"/>
-          <w:tab w:val="left" w:pos="13740"/>
-          <w:tab w:val="left" w:pos="14656"/>
-        </w:tabs>
-        <w:spacing w:after="0" w:line="240" w:lineRule="auto"/>
-        <w:rPr>
-          <w:rFonts w:ascii="Courier New" w:eastAsia="Times New Roman" w:hAnsi="Courier New" w:cs="Courier New"/>
-          <w:kern w:val="0"/>
-          <w:sz w:val="20"/>
-          <w:szCs w:val="20"/>
-          <w14:ligatures w14:val="none"/>
-        </w:rPr>
-      </w:pPr>
-      <w:r>
-        <w:rPr>
-          <w:rFonts w:ascii="Courier New" w:eastAsia="Times New Roman" w:hAnsi="Courier New" w:cs="Courier New"/>
-          <w:kern w:val="0"/>
-          <w:sz w:val="20"/>
-          <w:szCs w:val="20"/>
-          <w14:ligatures w14:val="none"/>
-        </w:rPr>
-        <w:t>- Skills: [N] exacts</w:t>
-      </w:r>
-    </w:p>
-    <w:p>
-      <w:pPr>
-        <w:tabs>
-          <w:tab w:val="left" w:pos="916"/>
-          <w:tab w:val="left" w:pos="1832"/>
-          <w:tab w:val="left" w:pos="2748"/>
-          <w:tab w:val="left" w:pos="3664"/>
-          <w:tab w:val="left" w:pos="4580"/>
-          <w:tab w:val="left" w:pos="5496"/>
-          <w:tab w:val="left" w:pos="6412"/>
-          <w:tab w:val="left" w:pos="7328"/>
-          <w:tab w:val="left" w:pos="8244"/>
-          <w:tab w:val="left" w:pos="9160"/>
-          <w:tab w:val="left" w:pos="10076"/>
-          <w:tab w:val="left" w:pos="10992"/>
-          <w:tab w:val="left" w:pos="11908"/>
-          <w:tab w:val="left" w:pos="12824"/>
-          <w:tab w:val="left" w:pos="13740"/>
-          <w:tab w:val="left" w:pos="14656"/>
-        </w:tabs>
-        <w:spacing w:after="0" w:line="240" w:lineRule="auto"/>
-        <w:rPr>
-          <w:rFonts w:ascii="Courier New" w:eastAsia="Times New Roman" w:hAnsi="Courier New" w:cs="Courier New"/>
-          <w:kern w:val="0"/>
-          <w:sz w:val="20"/>
-          <w:szCs w:val="20"/>
-          <w14:ligatures w14:val="none"/>
-        </w:rPr>
-      </w:pPr>
-      <w:r>
-        <w:rPr>
-          <w:rFonts w:ascii="Courier New" w:eastAsia="Times New Roman" w:hAnsi="Courier New" w:cs="Courier New"/>
-          <w:kern w:val="0"/>
-          <w:sz w:val="20"/>
-          <w:szCs w:val="20"/>
-          <w14:ligatures w14:val="none"/>
-        </w:rPr>
-        <w:t>- Body: [N] exacts</w:t>
-      </w:r>
-    </w:p>
-    <w:p>
-      <w:pPr>
-        <w:tabs>
-          <w:tab w:val="left" w:pos="916"/>
-          <w:tab w:val="left" w:pos="1832"/>
-          <w:tab w:val="left" w:pos="2748"/>
-          <w:tab w:val="left" w:pos="3664"/>
-          <w:tab w:val="left" w:pos="4580"/>
-          <w:tab w:val="left" w:pos="5496"/>
-          <w:tab w:val="left" w:pos="6412"/>
-          <w:tab w:val="left" w:pos="7328"/>
-          <w:tab w:val="left" w:pos="8244"/>
-          <w:tab w:val="left" w:pos="9160"/>
-          <w:tab w:val="left" w:pos="10076"/>
-          <w:tab w:val="left" w:pos="10992"/>
-          <w:tab w:val="left" w:pos="11908"/>
-          <w:tab w:val="left" w:pos="12824"/>
-          <w:tab w:val="left" w:pos="13740"/>
-          <w:tab w:val="left" w:pos="14656"/>
-        </w:tabs>
-        <w:spacing w:after="0" w:line="240" w:lineRule="auto"/>
-        <w:rPr>
-          <w:rFonts w:ascii="Courier New" w:eastAsia="Times New Roman" w:hAnsi="Courier New" w:cs="Courier New"/>
-          <w:kern w:val="0"/>
-          <w:sz w:val="20"/>
-          <w:szCs w:val="20"/>
-          <w14:ligatures w14:val="none"/>
-        </w:rPr>
-      </w:pPr>
-    </w:p>
-    <w:p>
-      <w:pPr>
-        <w:tabs>
-          <w:tab w:val="left" w:pos="916"/>
-          <w:tab w:val="left" w:pos="1832"/>
-          <w:tab w:val="left" w:pos="2748"/>
-          <w:tab w:val="left" w:pos="3664"/>
-          <w:tab w:val="left" w:pos="4580"/>
-          <w:tab w:val="left" w:pos="5496"/>
-          <w:tab w:val="left" w:pos="6412"/>
-          <w:tab w:val="left" w:pos="7328"/>
-          <w:tab w:val="left" w:pos="8244"/>
-          <w:tab w:val="left" w:pos="9160"/>
-          <w:tab w:val="left" w:pos="10076"/>
-          <w:tab w:val="left" w:pos="10992"/>
-          <w:tab w:val="left" w:pos="11908"/>
-          <w:tab w:val="left" w:pos="12824"/>
-          <w:tab w:val="left" w:pos="13740"/>
-          <w:tab w:val="left" w:pos="14656"/>
-        </w:tabs>
-        <w:spacing w:after="0" w:line="240" w:lineRule="auto"/>
-        <w:rPr>
-          <w:rFonts w:ascii="Courier New" w:eastAsia="Times New Roman" w:hAnsi="Courier New" w:cs="Courier New"/>
-          <w:kern w:val="0"/>
-          <w:sz w:val="20"/>
-          <w:szCs w:val="20"/>
-          <w14:ligatures w14:val="none"/>
-        </w:rPr>
-      </w:pPr>
-      <w:r>
-        <w:rPr>
-          <w:rFonts w:ascii="Courier New" w:eastAsia="Times New Roman" w:hAnsi="Courier New" w:cs="Courier New"/>
-          <w:kern w:val="0"/>
-          <w:sz w:val="20"/>
-          <w:szCs w:val="20"/>
-          <w14:ligatures w14:val="none"/>
-        </w:rPr>
-        <w:t>Potential Concerns:</w:t>
-      </w:r>
-    </w:p>
-    <w:p>
-      <w:pPr>
-        <w:tabs>
-          <w:tab w:val="left" w:pos="916"/>
-          <w:tab w:val="left" w:pos="1832"/>
-          <w:tab w:val="left" w:pos="2748"/>
-          <w:tab w:val="left" w:pos="3664"/>
-          <w:tab w:val="left" w:pos="4580"/>
-          <w:tab w:val="left" w:pos="5496"/>
-          <w:tab w:val="left" w:pos="6412"/>
-          <w:tab w:val="left" w:pos="7328"/>
-          <w:tab w:val="left" w:pos="8244"/>
-          <w:tab w:val="left" w:pos="9160"/>
-          <w:tab w:val="left" w:pos="10076"/>
-          <w:tab w:val="left" w:pos="10992"/>
-          <w:tab w:val="left" w:pos="11908"/>
-          <w:tab w:val="left" w:pos="12824"/>
-          <w:tab w:val="left" w:pos="13740"/>
-          <w:tab w:val="left" w:pos="14656"/>
-        </w:tabs>
-        <w:spacing w:after="0" w:line="240" w:lineRule="auto"/>
-        <w:rPr>
-          <w:rFonts w:ascii="Courier New" w:eastAsia="Times New Roman" w:hAnsi="Courier New" w:cs="Courier New"/>
-          <w:kern w:val="0"/>
-          <w:sz w:val="20"/>
-          <w:szCs w:val="20"/>
-          <w14:ligatures w14:val="none"/>
-        </w:rPr>
-      </w:pPr>
-      <w:r>
-        <w:rPr>
-          <w:rFonts w:ascii="Courier New" w:eastAsia="Times New Roman" w:hAnsi="Courier New" w:cs="Courier New"/>
-          <w:kern w:val="0"/>
-          <w:sz w:val="20"/>
-          <w:szCs w:val="20"/>
-          <w14:ligatures w14:val="none"/>
-        </w:rPr>
-        <w:t>- [Any remaining gaps or weak areas]</w:t>
-      </w:r>
-    </w:p>
-    <w:p>
-      <w:pPr>
-        <w:tabs>
-          <w:tab w:val="left" w:pos="916"/>
-          <w:tab w:val="left" w:pos="1832"/>
-          <w:tab w:val="left" w:pos="2748"/>
-          <w:tab w:val="left" w:pos="3664"/>
-          <w:tab w:val="left" w:pos="4580"/>
-          <w:tab w:val="left" w:pos="5496"/>
-          <w:tab w:val="left" w:pos="6412"/>
-          <w:tab w:val="left" w:pos="7328"/>
-          <w:tab w:val="left" w:pos="8244"/>
-          <w:tab w:val="left" w:pos="9160"/>
-          <w:tab w:val="left" w:pos="10076"/>
-          <w:tab w:val="left" w:pos="10992"/>
-          <w:tab w:val="left" w:pos="11908"/>
-          <w:tab w:val="left" w:pos="12824"/>
-          <w:tab w:val="left" w:pos="13740"/>
-          <w:tab w:val="left" w:pos="14656"/>
-        </w:tabs>
-        <w:spacing w:after="0" w:line="240" w:lineRule="auto"/>
-        <w:rPr>
-          <w:rFonts w:ascii="Courier New" w:eastAsia="Times New Roman" w:hAnsi="Courier New" w:cs="Courier New"/>
-          <w:kern w:val="0"/>
-          <w:sz w:val="20"/>
-          <w:szCs w:val="20"/>
-          <w14:ligatures w14:val="none"/>
-        </w:rPr>
-      </w:pPr>
-    </w:p>
-    <w:p>
-      <w:pPr>
-        <w:tabs>
-          <w:tab w:val="left" w:pos="916"/>
-          <w:tab w:val="left" w:pos="1832"/>
-          <w:tab w:val="left" w:pos="2748"/>
-          <w:tab w:val="left" w:pos="3664"/>
-          <w:tab w:val="left" w:pos="4580"/>
-          <w:tab w:val="left" w:pos="5496"/>
-          <w:tab w:val="left" w:pos="6412"/>
-          <w:tab w:val="left" w:pos="7328"/>
-          <w:tab w:val="left" w:pos="8244"/>
-          <w:tab w:val="left" w:pos="9160"/>
-          <w:tab w:val="left" w:pos="10076"/>
-          <w:tab w:val="left" w:pos="10992"/>
-          <w:tab w:val="left" w:pos="11908"/>
-          <w:tab w:val="left" w:pos="12824"/>
-          <w:tab w:val="left" w:pos="13740"/>
-          <w:tab w:val="left" w:pos="14656"/>
-        </w:tabs>
-        <w:spacing w:after="0" w:line="240" w:lineRule="auto"/>
-        <w:rPr>
-          <w:rFonts w:ascii="Courier New" w:eastAsia="Times New Roman" w:hAnsi="Courier New" w:cs="Courier New"/>
-          <w:kern w:val="0"/>
-          <w:sz w:val="20"/>
-          <w:szCs w:val="20"/>
-          <w14:ligatures w14:val="none"/>
-        </w:rPr>
-      </w:pPr>
-      <w:r>
-        <w:rPr>
-          <w:rFonts w:ascii="Courier New" w:eastAsia="Times New Roman" w:hAnsi="Courier New" w:cs="Courier New"/>
-          <w:kern w:val="0"/>
-          <w:sz w:val="20"/>
-          <w:szCs w:val="20"/>
-          <w14:ligatures w14:val="none"/>
-        </w:rPr>
-        <w:t>Interview Readiness:</w:t>
-      </w:r>
-    </w:p>
-    <w:p>
-      <w:pPr>
-        <w:tabs>
-          <w:tab w:val="left" w:pos="916"/>
-          <w:tab w:val="left" w:pos="1832"/>
-          <w:tab w:val="left" w:pos="2748"/>
-          <w:tab w:val="left" w:pos="3664"/>
-          <w:tab w:val="left" w:pos="4580"/>
-          <w:tab w:val="left" w:pos="5496"/>
-          <w:tab w:val="left" w:pos="6412"/>
-          <w:tab w:val="left" w:pos="7328"/>
-          <w:tab w:val="left" w:pos="8244"/>
-          <w:tab w:val="left" w:pos="9160"/>
-          <w:tab w:val="left" w:pos="10076"/>
-          <w:tab w:val="left" w:pos="10992"/>
-          <w:tab w:val="left" w:pos="11908"/>
-          <w:tab w:val="left" w:pos="12824"/>
-          <w:tab w:val="left" w:pos="13740"/>
-          <w:tab w:val="left" w:pos="14656"/>
-        </w:tabs>
-        <w:spacing w:after="0" w:line="240" w:lineRule="auto"/>
-        <w:rPr>
-          <w:rFonts w:ascii="Courier New" w:eastAsia="Times New Roman" w:hAnsi="Courier New" w:cs="Courier New"/>
-          <w:kern w:val="0"/>
-          <w:sz w:val="20"/>
-          <w:szCs w:val="20"/>
-          <w14:ligatures w14:val="none"/>
-        </w:rPr>
-      </w:pPr>
-      <w:r>
-        <w:rPr>
-          <w:rFonts w:ascii="Courier New" w:eastAsia="Times New Roman" w:hAnsi="Courier New" w:cs="Courier New"/>
-          <w:kern w:val="0"/>
-          <w:sz w:val="20"/>
-          <w:szCs w:val="20"/>
-          <w14:ligatures w14:val="none"/>
-        </w:rPr>
-        <w:t>- [Key talking points based on Evidence Ledger]</w:t>
+        <w:t>Run the same fixed harness from Module 2 Section 6 against the text EXACTLY as it will appear in D2, after Step 2 revisions, Step 2F project compression, and Gate 8 fixes. Fill offband_authorized with every Step 2a ALLOW_OFFBAND authorization, for example:</w:t>
+      </w:r>
+    </w:p>
+    <w:p>
+      <w:pPr>
+        <w:spacing w:after="0" w:line="240" w:lineRule="auto"/>
+        <w:rPr>
+          <w:rFonts w:ascii="Courier New" w:hAnsi="Courier New" w:cs="Courier New"/>
+          <w:sz w:val="18"/>
+          <w:szCs w:val="18"/>
+        </w:rPr>
+      </w:pPr>
+      <w:r>
+        <w:rPr>
+          <w:rFonts w:ascii="Courier New" w:hAnsi="Courier New" w:cs="Courier New"/>
+          <w:sz w:val="18"/>
+          <w:szCs w:val="18"/>
+        </w:rPr>
+        <w:t>offband_authorized = {"DOJ-B2": 28}</w:t>
+      </w:r>
+    </w:p>
+    <w:p>
+      <w:pPr>
+        <w:spacing w:before="100" w:beforeAutospacing="1" w:after="100" w:afterAutospacing="1" w:line="240" w:lineRule="auto"/>
+        <w:rPr>
+          <w:rFonts w:ascii="Times New Roman" w:eastAsia="Times New Roman" w:hAnsi="Times New Roman" w:cs="Times New Roman"/>
+          <w:kern w:val="0"/>
+          <w14:ligatures w14:val="none"/>
+        </w:rPr>
+      </w:pPr>
+      <w:r>
+        <w:rPr>
+          <w:rFonts w:ascii="Times New Roman" w:eastAsia="Times New Roman" w:hAnsi="Times New Roman" w:cs="Times New Roman"/>
+          <w:kern w:val="0"/>
+          <w14:ligatures w14:val="none"/>
+        </w:rPr>
+        <w:t>Fill all other DATA fields fresh from the final text. The report’s TEXT AS CHECKED block must match D2 verbatim; that echo is the user’s diff against approved D1.</w:t>
+      </w:r>
+    </w:p>
+    <w:p>
+      <w:pPr>
+        <w:spacing w:before="100" w:beforeAutospacing="1" w:after="100" w:afterAutospacing="1" w:line="240" w:lineRule="auto"/>
+        <w:rPr>
+          <w:rFonts w:ascii="Times New Roman" w:eastAsia="Times New Roman" w:hAnsi="Times New Roman" w:cs="Times New Roman"/>
+          <w:kern w:val="0"/>
+          <w14:ligatures w14:val="none"/>
+        </w:rPr>
+      </w:pPr>
+      <w:r>
+        <w:rPr>
+          <w:rFonts w:ascii="Times New Roman" w:eastAsia="Times New Roman" w:hAnsi="Times New Roman" w:cs="Times New Roman"/>
+          <w:kern w:val="0"/>
+          <w14:ligatures w14:val="none"/>
+        </w:rPr>
+        <w:t>This is the authoritative final check. It exists because Run A predates Step 2 revisions, and it runs after Gate 8 because proofreading fixes can change words. Any BLOCKING item: do NOT output D2. Present the violation and the relevant Evidence Ledger row to the user per Gate 3 rules and return to the appropriate step; do not auto-compress. Proceed to the D2 Quality Scorecard only on a PASS [Y] verdict.</w:t>
       </w:r>
     </w:p>
     <w:p>
@@ -27608,6 +26902,691 @@
           <w:szCs w:val="27"/>
           <w14:ligatures w14:val="none"/>
         </w:rPr>
+        <w:t>Step 4: ATS Confidence Score</w:t>
+      </w:r>
+    </w:p>
+    <w:p>
+      <w:pPr>
+        <w:spacing w:before="100" w:beforeAutospacing="1" w:after="100" w:afterAutospacing="1" w:line="240" w:lineRule="auto"/>
+        <w:rPr>
+          <w:rFonts w:ascii="Times New Roman" w:eastAsia="Times New Roman" w:hAnsi="Times New Roman" w:cs="Times New Roman"/>
+          <w:kern w:val="0"/>
+          <w14:ligatures w14:val="none"/>
+        </w:rPr>
+      </w:pPr>
+      <w:r>
+        <w:rPr>
+          <w:rFonts w:ascii="Times New Roman" w:eastAsia="Times New Roman" w:hAnsi="Times New Roman" w:cs="Times New Roman"/>
+          <w:kern w:val="0"/>
+          <w14:ligatures w14:val="none"/>
+        </w:rPr>
+        <w:t>Calculate and display:</w:t>
+      </w:r>
+    </w:p>
+    <w:p>
+      <w:pPr>
+        <w:tabs>
+          <w:tab w:val="left" w:pos="916"/>
+          <w:tab w:val="left" w:pos="1832"/>
+          <w:tab w:val="left" w:pos="2748"/>
+          <w:tab w:val="left" w:pos="3664"/>
+          <w:tab w:val="left" w:pos="4580"/>
+          <w:tab w:val="left" w:pos="5496"/>
+          <w:tab w:val="left" w:pos="6412"/>
+          <w:tab w:val="left" w:pos="7328"/>
+          <w:tab w:val="left" w:pos="8244"/>
+          <w:tab w:val="left" w:pos="9160"/>
+          <w:tab w:val="left" w:pos="10076"/>
+          <w:tab w:val="left" w:pos="10992"/>
+          <w:tab w:val="left" w:pos="11908"/>
+          <w:tab w:val="left" w:pos="12824"/>
+          <w:tab w:val="left" w:pos="13740"/>
+          <w:tab w:val="left" w:pos="14656"/>
+        </w:tabs>
+        <w:spacing w:after="0" w:line="240" w:lineRule="auto"/>
+        <w:rPr>
+          <w:rFonts w:ascii="Courier New" w:eastAsia="Times New Roman" w:hAnsi="Courier New" w:cs="Courier New"/>
+          <w:kern w:val="0"/>
+          <w:sz w:val="20"/>
+          <w:szCs w:val="20"/>
+          <w14:ligatures w14:val="none"/>
+        </w:rPr>
+      </w:pPr>
+      <w:r>
+        <w:rPr>
+          <w:rFonts w:ascii="Courier New" w:eastAsia="Times New Roman" w:hAnsi="Courier New" w:cs="Courier New"/>
+          <w:kern w:val="0"/>
+          <w:sz w:val="20"/>
+          <w:szCs w:val="20"/>
+          <w14:ligatures w14:val="none"/>
+        </w:rPr>
+        <w:t>**ATS CONFIDENCE: [HIGH / MEDIUM / LOW]**</w:t>
+      </w:r>
+    </w:p>
+    <w:p>
+      <w:pPr>
+        <w:tabs>
+          <w:tab w:val="left" w:pos="916"/>
+          <w:tab w:val="left" w:pos="1832"/>
+          <w:tab w:val="left" w:pos="2748"/>
+          <w:tab w:val="left" w:pos="3664"/>
+          <w:tab w:val="left" w:pos="4580"/>
+          <w:tab w:val="left" w:pos="5496"/>
+          <w:tab w:val="left" w:pos="6412"/>
+          <w:tab w:val="left" w:pos="7328"/>
+          <w:tab w:val="left" w:pos="8244"/>
+          <w:tab w:val="left" w:pos="9160"/>
+          <w:tab w:val="left" w:pos="10076"/>
+          <w:tab w:val="left" w:pos="10992"/>
+          <w:tab w:val="left" w:pos="11908"/>
+          <w:tab w:val="left" w:pos="12824"/>
+          <w:tab w:val="left" w:pos="13740"/>
+          <w:tab w:val="left" w:pos="14656"/>
+        </w:tabs>
+        <w:spacing w:after="0" w:line="240" w:lineRule="auto"/>
+        <w:rPr>
+          <w:rFonts w:ascii="Courier New" w:eastAsia="Times New Roman" w:hAnsi="Courier New" w:cs="Courier New"/>
+          <w:kern w:val="0"/>
+          <w:sz w:val="20"/>
+          <w:szCs w:val="20"/>
+          <w14:ligatures w14:val="none"/>
+        </w:rPr>
+      </w:pPr>
+    </w:p>
+    <w:p>
+      <w:pPr>
+        <w:tabs>
+          <w:tab w:val="left" w:pos="916"/>
+          <w:tab w:val="left" w:pos="1832"/>
+          <w:tab w:val="left" w:pos="2748"/>
+          <w:tab w:val="left" w:pos="3664"/>
+          <w:tab w:val="left" w:pos="4580"/>
+          <w:tab w:val="left" w:pos="5496"/>
+          <w:tab w:val="left" w:pos="6412"/>
+          <w:tab w:val="left" w:pos="7328"/>
+          <w:tab w:val="left" w:pos="8244"/>
+          <w:tab w:val="left" w:pos="9160"/>
+          <w:tab w:val="left" w:pos="10076"/>
+          <w:tab w:val="left" w:pos="10992"/>
+          <w:tab w:val="left" w:pos="11908"/>
+          <w:tab w:val="left" w:pos="12824"/>
+          <w:tab w:val="left" w:pos="13740"/>
+          <w:tab w:val="left" w:pos="14656"/>
+        </w:tabs>
+        <w:spacing w:after="0" w:line="240" w:lineRule="auto"/>
+        <w:rPr>
+          <w:rFonts w:ascii="Courier New" w:eastAsia="Times New Roman" w:hAnsi="Courier New" w:cs="Courier New"/>
+          <w:kern w:val="0"/>
+          <w:sz w:val="20"/>
+          <w:szCs w:val="20"/>
+          <w14:ligatures w14:val="none"/>
+        </w:rPr>
+      </w:pPr>
+      <w:r>
+        <w:rPr>
+          <w:rFonts w:ascii="Courier New" w:eastAsia="Times New Roman" w:hAnsi="Courier New" w:cs="Courier New"/>
+          <w:kern w:val="0"/>
+          <w:sz w:val="20"/>
+          <w:szCs w:val="20"/>
+          <w14:ligatures w14:val="none"/>
+        </w:rPr>
+        <w:t>Criticals Coverage: [N] of [Total] ([Percentage]%)</w:t>
+      </w:r>
+    </w:p>
+    <w:p>
+      <w:pPr>
+        <w:tabs>
+          <w:tab w:val="left" w:pos="916"/>
+          <w:tab w:val="left" w:pos="1832"/>
+          <w:tab w:val="left" w:pos="2748"/>
+          <w:tab w:val="left" w:pos="3664"/>
+          <w:tab w:val="left" w:pos="4580"/>
+          <w:tab w:val="left" w:pos="5496"/>
+          <w:tab w:val="left" w:pos="6412"/>
+          <w:tab w:val="left" w:pos="7328"/>
+          <w:tab w:val="left" w:pos="8244"/>
+          <w:tab w:val="left" w:pos="9160"/>
+          <w:tab w:val="left" w:pos="10076"/>
+          <w:tab w:val="left" w:pos="10992"/>
+          <w:tab w:val="left" w:pos="11908"/>
+          <w:tab w:val="left" w:pos="12824"/>
+          <w:tab w:val="left" w:pos="13740"/>
+          <w:tab w:val="left" w:pos="14656"/>
+        </w:tabs>
+        <w:spacing w:after="0" w:line="240" w:lineRule="auto"/>
+        <w:rPr>
+          <w:rFonts w:ascii="Courier New" w:eastAsia="Times New Roman" w:hAnsi="Courier New" w:cs="Courier New"/>
+          <w:kern w:val="0"/>
+          <w:sz w:val="20"/>
+          <w:szCs w:val="20"/>
+          <w14:ligatures w14:val="none"/>
+        </w:rPr>
+      </w:pPr>
+      <w:r>
+        <w:rPr>
+          <w:rFonts w:ascii="Courier New" w:eastAsia="Times New Roman" w:hAnsi="Courier New" w:cs="Courier New"/>
+          <w:kern w:val="0"/>
+          <w:sz w:val="20"/>
+          <w:szCs w:val="20"/>
+          <w14:ligatures w14:val="none"/>
+        </w:rPr>
+        <w:t>- MUST requirements: [N] of [N] covered</w:t>
+      </w:r>
+    </w:p>
+    <w:p>
+      <w:pPr>
+        <w:tabs>
+          <w:tab w:val="left" w:pos="916"/>
+          <w:tab w:val="left" w:pos="1832"/>
+          <w:tab w:val="left" w:pos="2748"/>
+          <w:tab w:val="left" w:pos="3664"/>
+          <w:tab w:val="left" w:pos="4580"/>
+          <w:tab w:val="left" w:pos="5496"/>
+          <w:tab w:val="left" w:pos="6412"/>
+          <w:tab w:val="left" w:pos="7328"/>
+          <w:tab w:val="left" w:pos="8244"/>
+          <w:tab w:val="left" w:pos="9160"/>
+          <w:tab w:val="left" w:pos="10076"/>
+          <w:tab w:val="left" w:pos="10992"/>
+          <w:tab w:val="left" w:pos="11908"/>
+          <w:tab w:val="left" w:pos="12824"/>
+          <w:tab w:val="left" w:pos="13740"/>
+          <w:tab w:val="left" w:pos="14656"/>
+        </w:tabs>
+        <w:spacing w:after="0" w:line="240" w:lineRule="auto"/>
+        <w:rPr>
+          <w:rFonts w:ascii="Courier New" w:eastAsia="Times New Roman" w:hAnsi="Courier New" w:cs="Courier New"/>
+          <w:kern w:val="0"/>
+          <w:sz w:val="20"/>
+          <w:szCs w:val="20"/>
+          <w14:ligatures w14:val="none"/>
+        </w:rPr>
+      </w:pPr>
+      <w:r>
+        <w:rPr>
+          <w:rFonts w:ascii="Courier New" w:eastAsia="Times New Roman" w:hAnsi="Courier New" w:cs="Courier New"/>
+          <w:kern w:val="0"/>
+          <w:sz w:val="20"/>
+          <w:szCs w:val="20"/>
+          <w14:ligatures w14:val="none"/>
+        </w:rPr>
+        <w:t>- LIKELY_MUST: [N] of [N] covered</w:t>
+      </w:r>
+    </w:p>
+    <w:p>
+      <w:pPr>
+        <w:tabs>
+          <w:tab w:val="left" w:pos="916"/>
+          <w:tab w:val="left" w:pos="1832"/>
+          <w:tab w:val="left" w:pos="2748"/>
+          <w:tab w:val="left" w:pos="3664"/>
+          <w:tab w:val="left" w:pos="4580"/>
+          <w:tab w:val="left" w:pos="5496"/>
+          <w:tab w:val="left" w:pos="6412"/>
+          <w:tab w:val="left" w:pos="7328"/>
+          <w:tab w:val="left" w:pos="8244"/>
+          <w:tab w:val="left" w:pos="9160"/>
+          <w:tab w:val="left" w:pos="10076"/>
+          <w:tab w:val="left" w:pos="10992"/>
+          <w:tab w:val="left" w:pos="11908"/>
+          <w:tab w:val="left" w:pos="12824"/>
+          <w:tab w:val="left" w:pos="13740"/>
+          <w:tab w:val="left" w:pos="14656"/>
+        </w:tabs>
+        <w:spacing w:after="0" w:line="240" w:lineRule="auto"/>
+        <w:rPr>
+          <w:rFonts w:ascii="Courier New" w:eastAsia="Times New Roman" w:hAnsi="Courier New" w:cs="Courier New"/>
+          <w:kern w:val="0"/>
+          <w:sz w:val="20"/>
+          <w:szCs w:val="20"/>
+          <w14:ligatures w14:val="none"/>
+        </w:rPr>
+      </w:pPr>
+      <w:r>
+        <w:rPr>
+          <w:rFonts w:ascii="Courier New" w:eastAsia="Times New Roman" w:hAnsi="Courier New" w:cs="Courier New"/>
+          <w:kern w:val="0"/>
+          <w:sz w:val="20"/>
+          <w:szCs w:val="20"/>
+          <w14:ligatures w14:val="none"/>
+        </w:rPr>
+        <w:t>- ADVISORY: [N] of [N] covered</w:t>
+      </w:r>
+    </w:p>
+    <w:p>
+      <w:pPr>
+        <w:tabs>
+          <w:tab w:val="left" w:pos="916"/>
+          <w:tab w:val="left" w:pos="1832"/>
+          <w:tab w:val="left" w:pos="2748"/>
+          <w:tab w:val="left" w:pos="3664"/>
+          <w:tab w:val="left" w:pos="4580"/>
+          <w:tab w:val="left" w:pos="5496"/>
+          <w:tab w:val="left" w:pos="6412"/>
+          <w:tab w:val="left" w:pos="7328"/>
+          <w:tab w:val="left" w:pos="8244"/>
+          <w:tab w:val="left" w:pos="9160"/>
+          <w:tab w:val="left" w:pos="10076"/>
+          <w:tab w:val="left" w:pos="10992"/>
+          <w:tab w:val="left" w:pos="11908"/>
+          <w:tab w:val="left" w:pos="12824"/>
+          <w:tab w:val="left" w:pos="13740"/>
+          <w:tab w:val="left" w:pos="14656"/>
+        </w:tabs>
+        <w:spacing w:after="0" w:line="240" w:lineRule="auto"/>
+        <w:rPr>
+          <w:rFonts w:ascii="Courier New" w:eastAsia="Times New Roman" w:hAnsi="Courier New" w:cs="Courier New"/>
+          <w:kern w:val="0"/>
+          <w:sz w:val="20"/>
+          <w:szCs w:val="20"/>
+          <w14:ligatures w14:val="none"/>
+        </w:rPr>
+      </w:pPr>
+    </w:p>
+    <w:p>
+      <w:pPr>
+        <w:tabs>
+          <w:tab w:val="left" w:pos="916"/>
+          <w:tab w:val="left" w:pos="1832"/>
+          <w:tab w:val="left" w:pos="2748"/>
+          <w:tab w:val="left" w:pos="3664"/>
+          <w:tab w:val="left" w:pos="4580"/>
+          <w:tab w:val="left" w:pos="5496"/>
+          <w:tab w:val="left" w:pos="6412"/>
+          <w:tab w:val="left" w:pos="7328"/>
+          <w:tab w:val="left" w:pos="8244"/>
+          <w:tab w:val="left" w:pos="9160"/>
+          <w:tab w:val="left" w:pos="10076"/>
+          <w:tab w:val="left" w:pos="10992"/>
+          <w:tab w:val="left" w:pos="11908"/>
+          <w:tab w:val="left" w:pos="12824"/>
+          <w:tab w:val="left" w:pos="13740"/>
+          <w:tab w:val="left" w:pos="14656"/>
+        </w:tabs>
+        <w:spacing w:after="0" w:line="240" w:lineRule="auto"/>
+        <w:rPr>
+          <w:rFonts w:ascii="Courier New" w:eastAsia="Times New Roman" w:hAnsi="Courier New" w:cs="Courier New"/>
+          <w:kern w:val="0"/>
+          <w:sz w:val="20"/>
+          <w:szCs w:val="20"/>
+          <w14:ligatures w14:val="none"/>
+        </w:rPr>
+      </w:pPr>
+      <w:r>
+        <w:rPr>
+          <w:rFonts w:ascii="Courier New" w:eastAsia="Times New Roman" w:hAnsi="Courier New" w:cs="Courier New"/>
+          <w:kern w:val="0"/>
+          <w:sz w:val="20"/>
+          <w:szCs w:val="20"/>
+          <w14:ligatures w14:val="none"/>
+        </w:rPr>
+        <w:t>Exact Phrase Placement:</w:t>
+      </w:r>
+    </w:p>
+    <w:p>
+      <w:pPr>
+        <w:tabs>
+          <w:tab w:val="left" w:pos="916"/>
+          <w:tab w:val="left" w:pos="1832"/>
+          <w:tab w:val="left" w:pos="2748"/>
+          <w:tab w:val="left" w:pos="3664"/>
+          <w:tab w:val="left" w:pos="4580"/>
+          <w:tab w:val="left" w:pos="5496"/>
+          <w:tab w:val="left" w:pos="6412"/>
+          <w:tab w:val="left" w:pos="7328"/>
+          <w:tab w:val="left" w:pos="8244"/>
+          <w:tab w:val="left" w:pos="9160"/>
+          <w:tab w:val="left" w:pos="10076"/>
+          <w:tab w:val="left" w:pos="10992"/>
+          <w:tab w:val="left" w:pos="11908"/>
+          <w:tab w:val="left" w:pos="12824"/>
+          <w:tab w:val="left" w:pos="13740"/>
+          <w:tab w:val="left" w:pos="14656"/>
+        </w:tabs>
+        <w:spacing w:after="0" w:line="240" w:lineRule="auto"/>
+        <w:rPr>
+          <w:rFonts w:ascii="Courier New" w:eastAsia="Times New Roman" w:hAnsi="Courier New" w:cs="Courier New"/>
+          <w:kern w:val="0"/>
+          <w:sz w:val="20"/>
+          <w:szCs w:val="20"/>
+          <w14:ligatures w14:val="none"/>
+        </w:rPr>
+      </w:pPr>
+      <w:r>
+        <w:rPr>
+          <w:rFonts w:ascii="Courier New" w:eastAsia="Times New Roman" w:hAnsi="Courier New" w:cs="Courier New"/>
+          <w:kern w:val="0"/>
+          <w:sz w:val="20"/>
+          <w:szCs w:val="20"/>
+          <w14:ligatures w14:val="none"/>
+        </w:rPr>
+        <w:t>- Summary: [N] exacts</w:t>
+      </w:r>
+    </w:p>
+    <w:p>
+      <w:pPr>
+        <w:tabs>
+          <w:tab w:val="left" w:pos="916"/>
+          <w:tab w:val="left" w:pos="1832"/>
+          <w:tab w:val="left" w:pos="2748"/>
+          <w:tab w:val="left" w:pos="3664"/>
+          <w:tab w:val="left" w:pos="4580"/>
+          <w:tab w:val="left" w:pos="5496"/>
+          <w:tab w:val="left" w:pos="6412"/>
+          <w:tab w:val="left" w:pos="7328"/>
+          <w:tab w:val="left" w:pos="8244"/>
+          <w:tab w:val="left" w:pos="9160"/>
+          <w:tab w:val="left" w:pos="10076"/>
+          <w:tab w:val="left" w:pos="10992"/>
+          <w:tab w:val="left" w:pos="11908"/>
+          <w:tab w:val="left" w:pos="12824"/>
+          <w:tab w:val="left" w:pos="13740"/>
+          <w:tab w:val="left" w:pos="14656"/>
+        </w:tabs>
+        <w:spacing w:after="0" w:line="240" w:lineRule="auto"/>
+        <w:rPr>
+          <w:rFonts w:ascii="Courier New" w:eastAsia="Times New Roman" w:hAnsi="Courier New" w:cs="Courier New"/>
+          <w:kern w:val="0"/>
+          <w:sz w:val="20"/>
+          <w:szCs w:val="20"/>
+          <w14:ligatures w14:val="none"/>
+        </w:rPr>
+      </w:pPr>
+      <w:r>
+        <w:rPr>
+          <w:rFonts w:ascii="Courier New" w:eastAsia="Times New Roman" w:hAnsi="Courier New" w:cs="Courier New"/>
+          <w:kern w:val="0"/>
+          <w:sz w:val="20"/>
+          <w:szCs w:val="20"/>
+          <w14:ligatures w14:val="none"/>
+        </w:rPr>
+        <w:t>- Skills: [N] exacts</w:t>
+      </w:r>
+    </w:p>
+    <w:p>
+      <w:pPr>
+        <w:tabs>
+          <w:tab w:val="left" w:pos="916"/>
+          <w:tab w:val="left" w:pos="1832"/>
+          <w:tab w:val="left" w:pos="2748"/>
+          <w:tab w:val="left" w:pos="3664"/>
+          <w:tab w:val="left" w:pos="4580"/>
+          <w:tab w:val="left" w:pos="5496"/>
+          <w:tab w:val="left" w:pos="6412"/>
+          <w:tab w:val="left" w:pos="7328"/>
+          <w:tab w:val="left" w:pos="8244"/>
+          <w:tab w:val="left" w:pos="9160"/>
+          <w:tab w:val="left" w:pos="10076"/>
+          <w:tab w:val="left" w:pos="10992"/>
+          <w:tab w:val="left" w:pos="11908"/>
+          <w:tab w:val="left" w:pos="12824"/>
+          <w:tab w:val="left" w:pos="13740"/>
+          <w:tab w:val="left" w:pos="14656"/>
+        </w:tabs>
+        <w:spacing w:after="0" w:line="240" w:lineRule="auto"/>
+        <w:rPr>
+          <w:rFonts w:ascii="Courier New" w:eastAsia="Times New Roman" w:hAnsi="Courier New" w:cs="Courier New"/>
+          <w:kern w:val="0"/>
+          <w:sz w:val="20"/>
+          <w:szCs w:val="20"/>
+          <w14:ligatures w14:val="none"/>
+        </w:rPr>
+      </w:pPr>
+      <w:r>
+        <w:rPr>
+          <w:rFonts w:ascii="Courier New" w:eastAsia="Times New Roman" w:hAnsi="Courier New" w:cs="Courier New"/>
+          <w:kern w:val="0"/>
+          <w:sz w:val="20"/>
+          <w:szCs w:val="20"/>
+          <w14:ligatures w14:val="none"/>
+        </w:rPr>
+        <w:t>- Body: [N] exacts</w:t>
+      </w:r>
+    </w:p>
+    <w:p>
+      <w:pPr>
+        <w:tabs>
+          <w:tab w:val="left" w:pos="916"/>
+          <w:tab w:val="left" w:pos="1832"/>
+          <w:tab w:val="left" w:pos="2748"/>
+          <w:tab w:val="left" w:pos="3664"/>
+          <w:tab w:val="left" w:pos="4580"/>
+          <w:tab w:val="left" w:pos="5496"/>
+          <w:tab w:val="left" w:pos="6412"/>
+          <w:tab w:val="left" w:pos="7328"/>
+          <w:tab w:val="left" w:pos="8244"/>
+          <w:tab w:val="left" w:pos="9160"/>
+          <w:tab w:val="left" w:pos="10076"/>
+          <w:tab w:val="left" w:pos="10992"/>
+          <w:tab w:val="left" w:pos="11908"/>
+          <w:tab w:val="left" w:pos="12824"/>
+          <w:tab w:val="left" w:pos="13740"/>
+          <w:tab w:val="left" w:pos="14656"/>
+        </w:tabs>
+        <w:spacing w:after="0" w:line="240" w:lineRule="auto"/>
+        <w:rPr>
+          <w:rFonts w:ascii="Courier New" w:eastAsia="Times New Roman" w:hAnsi="Courier New" w:cs="Courier New"/>
+          <w:kern w:val="0"/>
+          <w:sz w:val="20"/>
+          <w:szCs w:val="20"/>
+          <w14:ligatures w14:val="none"/>
+        </w:rPr>
+      </w:pPr>
+    </w:p>
+    <w:p>
+      <w:pPr>
+        <w:tabs>
+          <w:tab w:val="left" w:pos="916"/>
+          <w:tab w:val="left" w:pos="1832"/>
+          <w:tab w:val="left" w:pos="2748"/>
+          <w:tab w:val="left" w:pos="3664"/>
+          <w:tab w:val="left" w:pos="4580"/>
+          <w:tab w:val="left" w:pos="5496"/>
+          <w:tab w:val="left" w:pos="6412"/>
+          <w:tab w:val="left" w:pos="7328"/>
+          <w:tab w:val="left" w:pos="8244"/>
+          <w:tab w:val="left" w:pos="9160"/>
+          <w:tab w:val="left" w:pos="10076"/>
+          <w:tab w:val="left" w:pos="10992"/>
+          <w:tab w:val="left" w:pos="11908"/>
+          <w:tab w:val="left" w:pos="12824"/>
+          <w:tab w:val="left" w:pos="13740"/>
+          <w:tab w:val="left" w:pos="14656"/>
+        </w:tabs>
+        <w:spacing w:after="0" w:line="240" w:lineRule="auto"/>
+        <w:rPr>
+          <w:rFonts w:ascii="Courier New" w:eastAsia="Times New Roman" w:hAnsi="Courier New" w:cs="Courier New"/>
+          <w:kern w:val="0"/>
+          <w:sz w:val="20"/>
+          <w:szCs w:val="20"/>
+          <w14:ligatures w14:val="none"/>
+        </w:rPr>
+      </w:pPr>
+      <w:r>
+        <w:rPr>
+          <w:rFonts w:ascii="Courier New" w:eastAsia="Times New Roman" w:hAnsi="Courier New" w:cs="Courier New"/>
+          <w:kern w:val="0"/>
+          <w:sz w:val="20"/>
+          <w:szCs w:val="20"/>
+          <w14:ligatures w14:val="none"/>
+        </w:rPr>
+        <w:t>Potential Concerns:</w:t>
+      </w:r>
+    </w:p>
+    <w:p>
+      <w:pPr>
+        <w:tabs>
+          <w:tab w:val="left" w:pos="916"/>
+          <w:tab w:val="left" w:pos="1832"/>
+          <w:tab w:val="left" w:pos="2748"/>
+          <w:tab w:val="left" w:pos="3664"/>
+          <w:tab w:val="left" w:pos="4580"/>
+          <w:tab w:val="left" w:pos="5496"/>
+          <w:tab w:val="left" w:pos="6412"/>
+          <w:tab w:val="left" w:pos="7328"/>
+          <w:tab w:val="left" w:pos="8244"/>
+          <w:tab w:val="left" w:pos="9160"/>
+          <w:tab w:val="left" w:pos="10076"/>
+          <w:tab w:val="left" w:pos="10992"/>
+          <w:tab w:val="left" w:pos="11908"/>
+          <w:tab w:val="left" w:pos="12824"/>
+          <w:tab w:val="left" w:pos="13740"/>
+          <w:tab w:val="left" w:pos="14656"/>
+        </w:tabs>
+        <w:spacing w:after="0" w:line="240" w:lineRule="auto"/>
+        <w:rPr>
+          <w:rFonts w:ascii="Courier New" w:eastAsia="Times New Roman" w:hAnsi="Courier New" w:cs="Courier New"/>
+          <w:kern w:val="0"/>
+          <w:sz w:val="20"/>
+          <w:szCs w:val="20"/>
+          <w14:ligatures w14:val="none"/>
+        </w:rPr>
+      </w:pPr>
+      <w:r>
+        <w:rPr>
+          <w:rFonts w:ascii="Courier New" w:eastAsia="Times New Roman" w:hAnsi="Courier New" w:cs="Courier New"/>
+          <w:kern w:val="0"/>
+          <w:sz w:val="20"/>
+          <w:szCs w:val="20"/>
+          <w14:ligatures w14:val="none"/>
+        </w:rPr>
+        <w:t>- [Any remaining gaps or weak areas]</w:t>
+      </w:r>
+    </w:p>
+    <w:p>
+      <w:pPr>
+        <w:tabs>
+          <w:tab w:val="left" w:pos="916"/>
+          <w:tab w:val="left" w:pos="1832"/>
+          <w:tab w:val="left" w:pos="2748"/>
+          <w:tab w:val="left" w:pos="3664"/>
+          <w:tab w:val="left" w:pos="4580"/>
+          <w:tab w:val="left" w:pos="5496"/>
+          <w:tab w:val="left" w:pos="6412"/>
+          <w:tab w:val="left" w:pos="7328"/>
+          <w:tab w:val="left" w:pos="8244"/>
+          <w:tab w:val="left" w:pos="9160"/>
+          <w:tab w:val="left" w:pos="10076"/>
+          <w:tab w:val="left" w:pos="10992"/>
+          <w:tab w:val="left" w:pos="11908"/>
+          <w:tab w:val="left" w:pos="12824"/>
+          <w:tab w:val="left" w:pos="13740"/>
+          <w:tab w:val="left" w:pos="14656"/>
+        </w:tabs>
+        <w:spacing w:after="0" w:line="240" w:lineRule="auto"/>
+        <w:rPr>
+          <w:rFonts w:ascii="Courier New" w:eastAsia="Times New Roman" w:hAnsi="Courier New" w:cs="Courier New"/>
+          <w:kern w:val="0"/>
+          <w:sz w:val="20"/>
+          <w:szCs w:val="20"/>
+          <w14:ligatures w14:val="none"/>
+        </w:rPr>
+      </w:pPr>
+    </w:p>
+    <w:p>
+      <w:pPr>
+        <w:tabs>
+          <w:tab w:val="left" w:pos="916"/>
+          <w:tab w:val="left" w:pos="1832"/>
+          <w:tab w:val="left" w:pos="2748"/>
+          <w:tab w:val="left" w:pos="3664"/>
+          <w:tab w:val="left" w:pos="4580"/>
+          <w:tab w:val="left" w:pos="5496"/>
+          <w:tab w:val="left" w:pos="6412"/>
+          <w:tab w:val="left" w:pos="7328"/>
+          <w:tab w:val="left" w:pos="8244"/>
+          <w:tab w:val="left" w:pos="9160"/>
+          <w:tab w:val="left" w:pos="10076"/>
+          <w:tab w:val="left" w:pos="10992"/>
+          <w:tab w:val="left" w:pos="11908"/>
+          <w:tab w:val="left" w:pos="12824"/>
+          <w:tab w:val="left" w:pos="13740"/>
+          <w:tab w:val="left" w:pos="14656"/>
+        </w:tabs>
+        <w:spacing w:after="0" w:line="240" w:lineRule="auto"/>
+        <w:rPr>
+          <w:rFonts w:ascii="Courier New" w:eastAsia="Times New Roman" w:hAnsi="Courier New" w:cs="Courier New"/>
+          <w:kern w:val="0"/>
+          <w:sz w:val="20"/>
+          <w:szCs w:val="20"/>
+          <w14:ligatures w14:val="none"/>
+        </w:rPr>
+      </w:pPr>
+      <w:r>
+        <w:rPr>
+          <w:rFonts w:ascii="Courier New" w:eastAsia="Times New Roman" w:hAnsi="Courier New" w:cs="Courier New"/>
+          <w:kern w:val="0"/>
+          <w:sz w:val="20"/>
+          <w:szCs w:val="20"/>
+          <w14:ligatures w14:val="none"/>
+        </w:rPr>
+        <w:t>Interview Readiness:</w:t>
+      </w:r>
+    </w:p>
+    <w:p>
+      <w:pPr>
+        <w:tabs>
+          <w:tab w:val="left" w:pos="916"/>
+          <w:tab w:val="left" w:pos="1832"/>
+          <w:tab w:val="left" w:pos="2748"/>
+          <w:tab w:val="left" w:pos="3664"/>
+          <w:tab w:val="left" w:pos="4580"/>
+          <w:tab w:val="left" w:pos="5496"/>
+          <w:tab w:val="left" w:pos="6412"/>
+          <w:tab w:val="left" w:pos="7328"/>
+          <w:tab w:val="left" w:pos="8244"/>
+          <w:tab w:val="left" w:pos="9160"/>
+          <w:tab w:val="left" w:pos="10076"/>
+          <w:tab w:val="left" w:pos="10992"/>
+          <w:tab w:val="left" w:pos="11908"/>
+          <w:tab w:val="left" w:pos="12824"/>
+          <w:tab w:val="left" w:pos="13740"/>
+          <w:tab w:val="left" w:pos="14656"/>
+        </w:tabs>
+        <w:spacing w:after="0" w:line="240" w:lineRule="auto"/>
+        <w:rPr>
+          <w:rFonts w:ascii="Courier New" w:eastAsia="Times New Roman" w:hAnsi="Courier New" w:cs="Courier New"/>
+          <w:kern w:val="0"/>
+          <w:sz w:val="20"/>
+          <w:szCs w:val="20"/>
+          <w14:ligatures w14:val="none"/>
+        </w:rPr>
+      </w:pPr>
+      <w:r>
+        <w:rPr>
+          <w:rFonts w:ascii="Courier New" w:eastAsia="Times New Roman" w:hAnsi="Courier New" w:cs="Courier New"/>
+          <w:kern w:val="0"/>
+          <w:sz w:val="20"/>
+          <w:szCs w:val="20"/>
+          <w14:ligatures w14:val="none"/>
+        </w:rPr>
+        <w:t>- [Key talking points based on Evidence Ledger]</w:t>
+      </w:r>
+    </w:p>
+    <w:p>
+      <w:pPr>
+        <w:spacing w:before="100" w:beforeAutospacing="1" w:after="100" w:afterAutospacing="1" w:line="240" w:lineRule="auto"/>
+        <w:outlineLvl w:val="2"/>
+        <w:rPr>
+          <w:rFonts w:ascii="Times New Roman" w:eastAsia="Times New Roman" w:hAnsi="Times New Roman" w:cs="Times New Roman"/>
+          <w:b/>
+          <w:bCs/>
+          <w:kern w:val="0"/>
+          <w:sz w:val="27"/>
+          <w:szCs w:val="27"/>
+          <w14:ligatures w14:val="none"/>
+        </w:rPr>
+      </w:pPr>
+      <w:r>
+        <w:rPr>
+          <w:rFonts w:ascii="Times New Roman" w:eastAsia="Times New Roman" w:hAnsi="Times New Roman" w:cs="Times New Roman"/>
+          <w:b/>
+          <w:bCs/>
+          <w:kern w:val="0"/>
+          <w:sz w:val="27"/>
+          <w:szCs w:val="27"/>
+          <w14:ligatures w14:val="none"/>
+        </w:rPr>
         <w:t>Step 5: Densification Menu (Optional/Advisory)</w:t>
       </w:r>
     </w:p>
@@ -27736,7 +27715,6 @@
           <w:szCs w:val="20"/>
           <w14:ligatures w14:val="none"/>
         </w:rPr>
-        <w:lastRenderedPageBreak/>
         <w:t>LOW-IMPACT OPTIMIZATIONS (from Step 2 Audit):</w:t>
       </w:r>
     </w:p>
@@ -28080,7 +28058,7 @@
         </w:rPr>
       </w:pPr>
       <w:r>
-        <w:pict w14:anchorId="6B70DA71">
+        <w:pict w14:anchorId="34BE4F97">
           <v:rect id="Horizontal Line 29" o:spid="_x0000_s1029" alt="" style="width:468pt;height:.05pt;visibility:visible;mso-wrap-style:square;mso-width-percent:0;mso-height-percent:0;mso-left-percent:-10001;mso-top-percent:-10001;mso-position-horizontal:absolute;mso-position-horizontal-relative:char;mso-position-vertical:absolute;mso-position-vertical-relative:line;mso-width-percent:0;mso-height-percent:0;mso-left-percent:-10001;mso-top-percent:-10001;v-text-anchor:top" filled="f">
             <o:lock v:ext="edit" rotation="t" aspectratio="t" verticies="t" text="t" shapetype="t"/>
             <w10:anchorlock/>
@@ -28326,6 +28304,7 @@
           <w:kern w:val="0"/>
           <w14:ligatures w14:val="none"/>
         </w:rPr>
+        <w:lastRenderedPageBreak/>
         <w:t>All claims are Evidence-class or properly framed Exposure-class</w:t>
       </w:r>
     </w:p>
@@ -28566,8 +28545,76 @@
     </w:p>
     <w:p>
       <w:r>
+        <w:t>After Gate 8 proofreading passes and OUTPUT STANDARDS are verified, run this scorecard against the complete D2. This is the single summary view of resume quality before submission. Each dimension is a concrete, verifiable check.</w:t>
+      </w:r>
+    </w:p>
+    <w:p>
+      <w:r>
+        <w:rPr>
+          <w:b/>
+        </w:rPr>
+        <w:t>Print the full scorecard:</w:t>
+      </w:r>
+    </w:p>
+    <w:p>
+      <w:r>
+        <w:t>D2 QUALITY SCORECARD: [JD Title]</w:t>
+      </w:r>
+    </w:p>
+    <w:p>
+      <w:r>
+        <w:t>Dimension 1 — Evidence Integrity: Every metric matches a row in the Locked Metrics Table. No fabricated, decomposed, reverse-engineered, or observation-promoted metrics. Numeric-token verification is performed by Harness Run B (LOCKED METRICS exceptions); paste any. Directional semantics remain Dimension 11. Result: [PASS / FAIL: list violations]</w:t>
+      </w:r>
+    </w:p>
+    <w:p>
+      <w:r>
+        <w:t>Dimension 2 — Framing Ladder: Every TOP2 bullet’s opening verb tier (DELIVER/COORDINATE/CONTRIBUTE) verified against Evidence Ledger. No overclaiming. Result: [PASS / FAIL: list violations]</w:t>
+      </w:r>
+    </w:p>
+    <w:p>
+      <w:r>
+        <w:t>Dimension 3 — Word Counts: Paste the Harness Run B word-count table inline here. Do NOT summarize. Do NOT assert band compliance without per-bullet counts visible. The table must show BulletID, Count, and Assessment for every bullet. Then evaluate: if any bullet count &gt; 27 (TOP2) or &gt; 25 (older), Result: FAIL with the violating BulletID(s) listed. If all bullets confirmed within ceiling and Summary ≤ 75 words, Result: PASS. The scorecard cannot mark Dimension 3 PASS without the audit table reproduced — a narrative assertion of compliance is itself a FAIL.</w:t>
+      </w:r>
+    </w:p>
+    <w:p>
+      <w:r>
         <w:lastRenderedPageBreak/>
-        <w:t>After Gate 8 proofreading passes and OUTPUT STANDARDS are verified, run this scorecard against the complete D2. This is the single summary view of resume quality before submission. Each dimension is a concrete, verifiable check.</w:t>
+        <w:t>Dimension 4 — Opening Verbs: No verb appears 3+ times. Advisory pairs (2x) noted. Collective advisory escalation applied if 3+ advisory pairs. Computed by Harness Run B. Result: [PASS / FAIL: list violations]</w:t>
+      </w:r>
+    </w:p>
+    <w:p>
+      <w:r>
+        <w:t>Dimension 5 — Summary Quality: CHECK A (banned phrases): PASS/FAIL. CHECK B (redundancy): PASS/FAIL. CHECK C (opening variation): PASS/FAIL. CHECK D (positioning statement): PASS/FAIL. Result: [PASS / FAIL: list which check failed]</w:t>
+      </w:r>
+    </w:p>
+    <w:p>
+      <w:r>
+        <w:t>Dimension 6 — Filler Detection: No TOP2 bullet scores 2+/5 on filler indicators. Result: [PASS / FAIL: list flagged bullets]</w:t>
+      </w:r>
+    </w:p>
+    <w:p>
+      <w:r>
+        <w:t>Dimension 7 — Employment Continuity: All roles from source CV present. Collapsed roles have title and dates visible. Continuity verified by Harness Run B. Result: [PASS / FAIL: list missing roles]</w:t>
+      </w:r>
+    </w:p>
+    <w:p>
+      <w:r>
+        <w:t>Dimension 8 — Banned Phrases: Zero banned phrases in summary, bullets, or skills. Includes metadata leakage and defensive framing. String-exact items verified by Harness Run B; paste exceptions. Result: [PASS / FAIL: list found]</w:t>
+      </w:r>
+    </w:p>
+    <w:p>
+      <w:r>
+        <w:t>Dimension 9 — JD Coverage: Percentage of Frozen Criticals with Evidence-class body bullets. Result: [N/M = X%]</w:t>
+      </w:r>
+    </w:p>
+    <w:p>
+      <w:r>
+        <w:t>Dimension 10 — Project Relevance: All project lead bullets address the highest-priority Frozen Critical available in that project. Result: [PASS / FAIL: list misaligned]</w:t>
+      </w:r>
+    </w:p>
+    <w:p>
+      <w:r>
+        <w:t>Dimension 11 — Metric-Context Integrity: Every metric preserves what went up vs what went down. No inversions, no misattributions across roles. Result: [PASS / FAIL: list violations]</w:t>
       </w:r>
     </w:p>
     <w:p>
@@ -28575,68 +28622,43 @@
         <w:rPr>
           <w:b/>
         </w:rPr>
-        <w:t>Print the full scorecard:</w:t>
-      </w:r>
-    </w:p>
-    <w:p>
-      <w:r>
-        <w:t>D2 QUALITY SCORECARD: [JD Title]</w:t>
-      </w:r>
-    </w:p>
-    <w:p>
-      <w:r>
-        <w:t>Dimension 1 — Evidence Integrity: Every metric matches a row in the Locked Metrics Table. No fabricated, decomposed, reverse-engineered, or observation-promoted metrics. Result: [PASS / FAIL: list violations]</w:t>
-      </w:r>
-    </w:p>
-    <w:p>
-      <w:r>
-        <w:t>Dimension 2 — Framing Ladder: Every TOP2 bullet’s opening verb tier (DELIVER/COORDINATE/CONTRIBUTE) verified against Evidence Ledger. No overclaiming. Result: [PASS / FAIL: list violations]</w:t>
-      </w:r>
-    </w:p>
-    <w:p>
-      <w:r>
-        <w:t>Dimension 3 — Word Counts: Reproduce the Section 6 Gate 3 Re-verification audit table inline here. Do NOT summarize. Do NOT assert band compliance without per-bullet counts visible. The table must show BulletID, Count, and Assessment for every bullet. Then evaluate: if any bullet count &gt; 27 (TOP2) or &gt; 25 (older), Result: FAIL with the violating BulletID(s) listed. If all bullets confirmed within ceiling and Summary ≤ 75 words, Result: PASS. The scorecard cannot mark Dimension 3 PASS without the audit table reproduced — a narrative assertion of compliance is itself a FAIL.</w:t>
-      </w:r>
-    </w:p>
-    <w:p>
-      <w:r>
-        <w:t>Dimension 4 — Opening Verbs: No verb appears 3+ times. Advisory pairs (2x) noted. Collective advisory escalation applied if 3+ advisory pairs. Result: [PASS / FAIL: list violations]</w:t>
-      </w:r>
-    </w:p>
-    <w:p>
-      <w:r>
-        <w:t>Dimension 5 — Summary Quality: CHECK A (banned phrases): PASS/FAIL. CHECK B (redundancy): PASS/FAIL. CHECK C (opening variation): PASS/FAIL. CHECK D (positioning statement): PASS/FAIL. Result: [PASS / FAIL: list which check failed]</w:t>
-      </w:r>
-    </w:p>
-    <w:p>
-      <w:r>
-        <w:t>Dimension 6 — Filler Detection: No TOP2 bullet scores 2+/5 on filler indicators. Result: [PASS / FAIL: list flagged bullets]</w:t>
-      </w:r>
-    </w:p>
-    <w:p>
-      <w:r>
-        <w:t>Dimension 7 — Employment Continuity: All roles from source CV present. Collapsed roles have title and dates visible. Result: [PASS / FAIL: list missing roles]</w:t>
-      </w:r>
-    </w:p>
-    <w:p>
-      <w:r>
-        <w:t>Dimension 8 — Banned Phrases: Zero banned phrases in summary, bullets, or skills. Includes metadata leakage and defensive framing. Result: [PASS / FAIL: list found]</w:t>
-      </w:r>
-    </w:p>
-    <w:p>
-      <w:r>
-        <w:t>Dimension 9 — JD Coverage: Percentage of Frozen Criticals with Evidence-class body bullets. Result: [N/M = X%]</w:t>
+        <w:t>SCORING:</w:t>
+      </w:r>
+    </w:p>
+    <w:p>
+      <w:r>
+        <w:t>Count PASS results across Dimensions 1-8, 10, and 11 (the 10 binary checks). Dimension 9 (JD Coverage) is a percentage, not a binary.</w:t>
+      </w:r>
+    </w:p>
+    <w:p>
+      <w:r>
+        <w:t>10/10 PASS with 80%+ JD Coverage = 9+ rating. Submit.</w:t>
+      </w:r>
+    </w:p>
+    <w:p>
+      <w:r>
+        <w:t>10/10 PASS with 60-79% JD Coverage = 8.5 rating. Submit. Coverage gap is a fit issue, not quality.</w:t>
+      </w:r>
+    </w:p>
+    <w:p>
+      <w:r>
+        <w:t>9/10 PASS with 80%+ JD Coverage = 8.5 rating. Fix the one failing dimension, then submit.</w:t>
+      </w:r>
+    </w:p>
+    <w:p>
+      <w:r>
+        <w:t>8-9/10 PASS with 60-79% JD Coverage = 8 rating. Fix failing dimensions. Consider time investment.</w:t>
       </w:r>
     </w:p>
     <w:p>
       <w:r>
         <w:lastRenderedPageBreak/>
-        <w:t>Dimension 10 — Project Relevance: All project lead bullets address the highest-priority Frozen Critical available in that project. Result: [PASS / FAIL: list misaligned]</w:t>
-      </w:r>
-    </w:p>
-    <w:p>
-      <w:r>
-        <w:t>Dimension 11 — Metric-Context Integrity: Every metric preserves what went up vs what went down. No inversions, no misattributions across roles. Result: [PASS / FAIL: list violations]</w:t>
+        <w:t>7/10 PASS with any JD Coverage = 7-7.5 rating. Multiple quality issues. Consider career-ops volume track.</w:t>
+      </w:r>
+    </w:p>
+    <w:p>
+      <w:r>
+        <w:t>Below 7/10 PASS = Below 7 rating. Do not submit. Re-run Module 2 gates or start over.</w:t>
       </w:r>
     </w:p>
     <w:p>
@@ -28644,42 +28666,12 @@
         <w:rPr>
           <w:b/>
         </w:rPr>
-        <w:t>SCORING:</w:t>
-      </w:r>
-    </w:p>
-    <w:p>
-      <w:r>
-        <w:t>Count PASS results across Dimensions 1-8, 10, and 11 (the 10 binary checks). Dimension 9 (JD Coverage) is a percentage, not a binary.</w:t>
-      </w:r>
-    </w:p>
-    <w:p>
-      <w:r>
-        <w:t>10/10 PASS with 80%+ JD Coverage = 9+ rating. Submit.</w:t>
-      </w:r>
-    </w:p>
-    <w:p>
-      <w:r>
-        <w:t>10/10 PASS with 60-79% JD Coverage = 8.5 rating. Submit. Coverage gap is a fit issue, not quality.</w:t>
-      </w:r>
-    </w:p>
-    <w:p>
-      <w:r>
-        <w:t>9/10 PASS with 80%+ JD Coverage = 8.5 rating. Fix the one failing dimension, then submit.</w:t>
-      </w:r>
-    </w:p>
-    <w:p>
-      <w:r>
-        <w:t>8-9/10 PASS with 60-79% JD Coverage = 8 rating. Fix failing dimensions. Consider time investment.</w:t>
-      </w:r>
-    </w:p>
-    <w:p>
-      <w:r>
-        <w:t>7/10 PASS with any JD Coverage = 7-7.5 rating. Multiple quality issues. Consider career-ops volume track.</w:t>
-      </w:r>
-    </w:p>
-    <w:p>
-      <w:r>
-        <w:t>Below 7/10 PASS = Below 7 rating. Do not submit. Re-run Module 2 gates or start over.</w:t>
+        <w:t>IMPORTANT:</w:t>
+      </w:r>
+    </w:p>
+    <w:p>
+      <w:r>
+        <w:t>The scorecard is a verification tool, not an optimization loop. If the D2 scores 9+, output it. Do not chase 10/10 by rewriting bullets that already pass all checks — that introduces new errors. The scorecard catches problems. It does not create perfection through iteration.</w:t>
       </w:r>
     </w:p>
     <w:p>
@@ -28687,12 +28679,12 @@
         <w:rPr>
           <w:b/>
         </w:rPr>
-        <w:t>IMPORTANT:</w:t>
-      </w:r>
-    </w:p>
-    <w:p>
-      <w:r>
-        <w:t>The scorecard is a verification tool, not an optimization loop. If the D2 scores 9+, output it. Do not chase 10/10 by rewriting bullets that already pass all checks — that introduces new errors. The scorecard catches problems. It does not create perfection through iteration.</w:t>
+        <w:t>If any Dimension scores FAIL:</w:t>
+      </w:r>
+    </w:p>
+    <w:p>
+      <w:r>
+        <w:t>Print the specific violation(s) and the fix. Apply fixes to the D2. Re-run ONLY the affected Dimension to verify the fix resolved it. Do not re-run the entire scorecard — that risks introducing new changes to dimensions that already passed.</w:t>
       </w:r>
     </w:p>
     <w:p>
@@ -28700,19 +28692,6 @@
         <w:rPr>
           <w:b/>
         </w:rPr>
-        <w:t>If any Dimension scores FAIL:</w:t>
-      </w:r>
-    </w:p>
-    <w:p>
-      <w:r>
-        <w:t>Print the specific violation(s) and the fix. Apply fixes to the D2. Re-run ONLY the affected Dimension to verify the fix resolved it. Do not re-run the entire scorecard — that risks introducing new changes to dimensions that already passed.</w:t>
-      </w:r>
-    </w:p>
-    <w:p>
-      <w:r>
-        <w:rPr>
-          <w:b/>
-        </w:rPr>
         <w:t>D2 QUALITY SCORECARD OUTPUT:</w:t>
       </w:r>
     </w:p>
@@ -28733,7 +28712,6 @@
     </w:p>
     <w:p>
       <w:r>
-        <w:lastRenderedPageBreak/>
         <w:t>[If any FAIL:] FIXES REQUIRED BEFORE SUBMISSION: Dimension [#]: [specific fix]</w:t>
       </w:r>
     </w:p>
@@ -28752,7 +28730,7 @@
         </w:rPr>
       </w:pPr>
       <w:r>
-        <w:pict w14:anchorId="3BC1639F">
+        <w:pict w14:anchorId="698B26FA">
           <v:rect id="Horizontal Line 30" o:spid="_x0000_s1028" alt="" style="width:468pt;height:.05pt;visibility:visible;mso-wrap-style:square;mso-width-percent:0;mso-height-percent:0;mso-left-percent:-10001;mso-top-percent:-10001;mso-position-horizontal:absolute;mso-position-horizontal-relative:char;mso-position-vertical:absolute;mso-position-vertical-relative:line;mso-width-percent:0;mso-height-percent:0;mso-left-percent:-10001;mso-top-percent:-10001;v-text-anchor:top" filled="f">
             <o:lock v:ext="edit" rotation="t" aspectratio="t" verticies="t" text="t" shapetype="t"/>
             <w10:anchorlock/>
@@ -28772,7 +28750,7 @@
     </w:p>
     <w:p>
       <w:r>
-        <w:t>Completed so far: [Y] State Verification [Y] Step 1: Final Validation [Y] Step 2: Bullet Optimization Audit [Y] Step 2a: Offband (if triggered) [Y] Step 3: D2 Generated [Y] Step 3a: Gate 8 Proofreading [Y] D2 Quality Scorecard</w:t>
+        <w:t>Completed so far: [Y] State Verification [Y] Step 1: Final Validation [Y] Step 2: Bullet Optimization Audit [Y] Step 2a: Offband (if triggered) [Y] Step 3: D2 Generated [Y] Step 3a: Gate 8 Proofreading [Y] Step 3b: Harness Run B (PASS) [Y] D2 Quality Scorecard</w:t>
       </w:r>
     </w:p>
     <w:p>
@@ -29545,7 +29523,6 @@
           <w:szCs w:val="20"/>
           <w14:ligatures w14:val="none"/>
         </w:rPr>
-        <w:lastRenderedPageBreak/>
         <w:t>2. [Second strength]</w:t>
       </w:r>
     </w:p>
@@ -29929,7 +29906,7 @@
         </w:rPr>
       </w:pPr>
       <w:r>
-        <w:pict w14:anchorId="0F9948C0">
+        <w:pict w14:anchorId="196F5B1F">
           <v:rect id="Horizontal Line 31" o:spid="_x0000_s1027" alt="" style="width:468pt;height:.05pt;visibility:visible;mso-wrap-style:square;mso-width-percent:0;mso-height-percent:0;mso-left-percent:-10001;mso-top-percent:-10001;mso-position-horizontal:absolute;mso-position-horizontal-relative:char;mso-position-vertical:absolute;mso-position-vertical-relative:line;mso-width-percent:0;mso-height-percent:0;mso-left-percent:-10001;mso-top-percent:-10001;v-text-anchor:top" filled="f">
             <o:lock v:ext="edit" rotation="t" aspectratio="t" verticies="t" text="t" shapetype="t"/>
             <w10:anchorlock/>
@@ -30254,6 +30231,7 @@
                 <w:kern w:val="0"/>
                 <w14:ligatures w14:val="none"/>
               </w:rPr>
+              <w:lastRenderedPageBreak/>
               <w:t>Too long/short</w:t>
             </w:r>
           </w:p>
@@ -30279,7 +30257,7 @@
                 <w:kern w:val="0"/>
                 <w14:ligatures w14:val="none"/>
               </w:rPr>
-              <w:t>Verify word bands in Module 2 Gate 3</w:t>
+              <w:t>Verify against the Harness Run B word-count table</w:t>
             </w:r>
           </w:p>
         </w:tc>
@@ -30460,7 +30438,7 @@
         </w:rPr>
       </w:pPr>
       <w:r>
-        <w:pict w14:anchorId="25CF5E3B">
+        <w:pict w14:anchorId="40F3A6F1">
           <v:rect id="Horizontal Line 32" o:spid="_x0000_s1026" alt="" style="width:468pt;height:.05pt;visibility:visible;mso-wrap-style:square;mso-width-percent:0;mso-height-percent:0;mso-left-percent:-10001;mso-top-percent:-10001;mso-position-horizontal:absolute;mso-position-horizontal-relative:char;mso-position-vertical:absolute;mso-position-vertical-relative:line;mso-width-percent:0;mso-height-percent:0;mso-left-percent:-10001;mso-top-percent:-10001;v-text-anchor:top" filled="f">
             <o:lock v:ext="edit" rotation="t" aspectratio="t" verticies="t" text="t" shapetype="t"/>
             <w10:anchorlock/>
@@ -30480,7 +30458,7 @@
 </file>
 
 <file path=word/numbering.xml><?xml version="1.0" encoding="utf-8"?>
-<w:numbering xmlns:wpc="http://schemas.microsoft.com/office/word/2010/wordprocessingCanvas" xmlns:cx="http://schemas.microsoft.com/office/drawing/2014/chartex" xmlns:cx1="http://schemas.microsoft.com/office/drawing/2015/9/8/chartex" xmlns:cx2="http://schemas.microsoft.com/office/drawing/2015/10/21/chartex" xmlns:cx3="http://schemas.microsoft.com/office/drawing/2016/5/9/chartex" xmlns:cx4="http://schemas.microsoft.com/office/drawing/2016/5/10/chartex" xmlns:cx5="http://schemas.microsoft.com/office/drawing/2016/5/11/chartex" xmlns:cx6="http://schemas.microsoft.com/office/drawing/2016/5/12/chartex" xmlns:cx7="http://schemas.microsoft.com/office/drawing/2016/5/13/chartex" xmlns:cx8="http://schemas.microsoft.com/office/drawing/2016/5/14/chartex" xmlns:mc="http://schemas.openxmlformats.org/markup-compatibility/2006" xmlns:aink="http://schemas.microsoft.com/office/drawing/2016/ink" xmlns:am3d="http://schemas.microsoft.com/office/drawing/2017/model3d" xmlns:o="urn:schemas-microsoft-com:office:office" xmlns:oel="http://schemas.microsoft.com/office/2019/extlst" xmlns:r="http://schemas.openxmlformats.org/officeDocument/2006/relationships" xmlns:m="http://schemas.openxmlformats.org/officeDocument/2006/math" xmlns:v="urn:schemas-microsoft-com:vml" xmlns:wp14="http://schemas.microsoft.com/office/word/2010/wordprocessingDrawing" xmlns:wp="http://schemas.openxmlformats.org/drawingml/2006/wordprocessingDrawing" xmlns:w10="urn:schemas-microsoft-com:office:word" xmlns:w="http://schemas.openxmlformats.org/wordprocessingml/2006/main" xmlns:w14="http://schemas.microsoft.com/office/word/2010/wordml" xmlns:w15="http://schemas.microsoft.com/office/word/2012/wordml" xmlns:w16cex="http://schemas.microsoft.com/office/word/2018/wordml/cex" xmlns:w16cid="http://schemas.microsoft.com/office/word/2016/wordml/cid" xmlns:w16="http://schemas.microsoft.com/office/word/2018/wordml" xmlns:w16du="http://schemas.microsoft.com/office/word/2023/wordml/word16du" xmlns:w16sdtdh="http://schemas.microsoft.com/office/word/2020/wordml/sdtdatahash" xmlns:w16sdtfl="http://schemas.microsoft.com/office/word/2024/wordml/sdtformatlock" xmlns:w16se="http://schemas.microsoft.com/office/word/2015/wordml/symex" xmlns:wpg="http://schemas.microsoft.com/office/word/2010/wordprocessingGroup" xmlns:wpi="http://schemas.microsoft.com/office/word/2010/wordprocessingInk" xmlns:wne="http://schemas.microsoft.com/office/word/2006/wordml" xmlns:wps="http://schemas.microsoft.com/office/word/2010/wordprocessingShape" mc:Ignorable="w14 w15 w16se w16cid w16 w16cex w16sdtdh w16sdtfl w16du wp14">
+<w:numbering xmlns:wpc="http://schemas.microsoft.com/office/word/2010/wordprocessingCanvas" xmlns:cx="http://schemas.microsoft.com/office/drawing/2014/chartex" xmlns:cx1="http://schemas.microsoft.com/office/drawing/2015/9/8/chartex" xmlns:cx2="http://schemas.microsoft.com/office/drawing/2015/10/21/chartex" xmlns:cx3="http://schemas.microsoft.com/office/drawing/2016/5/9/chartex" xmlns:cx4="http://schemas.microsoft.com/office/drawing/2016/5/10/chartex" xmlns:cx5="http://schemas.microsoft.com/office/drawing/2016/5/11/chartex" xmlns:cx6="http://schemas.microsoft.com/office/drawing/2016/5/12/chartex" xmlns:cx7="http://schemas.microsoft.com/office/drawing/2016/5/13/chartex" xmlns:cx8="http://schemas.microsoft.com/office/drawing/2016/5/14/chartex" xmlns:mc="http://schemas.openxmlformats.org/markup-compatibility/2006" xmlns:m="http://schemas.openxmlformats.org/officeDocument/2006/math" xmlns:aink="http://schemas.microsoft.com/office/drawing/2016/ink" xmlns:am3d="http://schemas.microsoft.com/office/drawing/2017/model3d" xmlns:oel="http://schemas.microsoft.com/office/2019/extlst" xmlns:r="http://schemas.openxmlformats.org/officeDocument/2006/relationships" xmlns:wp14="http://schemas.microsoft.com/office/word/2010/wordprocessingDrawing" xmlns:wp="http://schemas.openxmlformats.org/drawingml/2006/wordprocessingDrawing" xmlns:wpg="http://schemas.microsoft.com/office/word/2010/wordprocessingGroup" xmlns:wpi="http://schemas.microsoft.com/office/word/2010/wordprocessingInk" xmlns:wps="http://schemas.microsoft.com/office/word/2010/wordprocessingShape" xmlns:o="urn:schemas-microsoft-com:office:office" xmlns:v="urn:schemas-microsoft-com:vml" xmlns:w10="urn:schemas-microsoft-com:office:word" xmlns:w="http://schemas.openxmlformats.org/wordprocessingml/2006/main" xmlns:w14="http://schemas.microsoft.com/office/word/2010/wordml" xmlns:w15="http://schemas.microsoft.com/office/word/2012/wordml" xmlns:w16cex="http://schemas.microsoft.com/office/word/2018/wordml/cex" xmlns:w16cid="http://schemas.microsoft.com/office/word/2016/wordml/cid" xmlns:w16="http://schemas.microsoft.com/office/word/2018/wordml" xmlns:w16sdtdh="http://schemas.microsoft.com/office/word/2020/wordml/sdtdatahash" xmlns:w16sdtfl="http://schemas.microsoft.com/office/word/2024/wordml/sdtformatlock" xmlns:w16se="http://schemas.microsoft.com/office/word/2015/wordml/symex" xmlns:w16du="http://schemas.microsoft.com/office/word/2023/wordml/word16du" xmlns:wne="http://schemas.microsoft.com/office/word/2006/wordml" mc:Ignorable="w14 w15 w16se w16cid w16 w16cex w16sdtdh w16sdtfl w16du wp14">
   <w:abstractNum w:abstractNumId="0" w15:restartNumberingAfterBreak="0">
     <w:nsid w:val="0B3B7C98"/>
     <w:multiLevelType w:val="multilevel"/>
@@ -34230,7 +34208,7 @@
 </file>
 
 <file path=word/styles.xml><?xml version="1.0" encoding="utf-8"?>
-<w:styles xmlns:mc="http://schemas.openxmlformats.org/markup-compatibility/2006" xmlns:r="http://schemas.openxmlformats.org/officeDocument/2006/relationships" xmlns:w="http://schemas.openxmlformats.org/wordprocessingml/2006/main" xmlns:w14="http://schemas.microsoft.com/office/word/2010/wordml" xmlns:w15="http://schemas.microsoft.com/office/word/2012/wordml" xmlns:w16cex="http://schemas.microsoft.com/office/word/2018/wordml/cex" xmlns:w16cid="http://schemas.microsoft.com/office/word/2016/wordml/cid" xmlns:w16="http://schemas.microsoft.com/office/word/2018/wordml" xmlns:w16du="http://schemas.microsoft.com/office/word/2023/wordml/word16du" xmlns:w16sdtdh="http://schemas.microsoft.com/office/word/2020/wordml/sdtdatahash" xmlns:w16sdtfl="http://schemas.microsoft.com/office/word/2024/wordml/sdtformatlock" xmlns:w16se="http://schemas.microsoft.com/office/word/2015/wordml/symex" mc:Ignorable="w14 w15 w16se w16cid w16 w16cex w16sdtdh w16sdtfl w16du">
+<w:styles xmlns:mc="http://schemas.openxmlformats.org/markup-compatibility/2006" xmlns:r="http://schemas.openxmlformats.org/officeDocument/2006/relationships" xmlns:w="http://schemas.openxmlformats.org/wordprocessingml/2006/main" xmlns:w14="http://schemas.microsoft.com/office/word/2010/wordml" xmlns:w15="http://schemas.microsoft.com/office/word/2012/wordml" xmlns:w16cex="http://schemas.microsoft.com/office/word/2018/wordml/cex" xmlns:w16cid="http://schemas.microsoft.com/office/word/2016/wordml/cid" xmlns:w16="http://schemas.microsoft.com/office/word/2018/wordml" xmlns:w16sdtdh="http://schemas.microsoft.com/office/word/2020/wordml/sdtdatahash" xmlns:w16sdtfl="http://schemas.microsoft.com/office/word/2024/wordml/sdtformatlock" xmlns:w16se="http://schemas.microsoft.com/office/word/2015/wordml/symex" xmlns:w16du="http://schemas.microsoft.com/office/word/2023/wordml/word16du" mc:Ignorable="w14 w15 w16se w16cid w16 w16cex w16sdtdh w16sdtfl w16du">
   <w:docDefaults>
     <w:rPrDefault>
       <w:rPr>

</xml_diff>